<commit_message>
update manuscript to remove placeholders
</commit_message>
<xml_diff>
--- a/manuscript.docx
+++ b/manuscript.docx
@@ -36,7 +36,7 @@
         <w:t xml:space="preserve"> </w:t>
       </w:r>
       <w:r>
-        <w:t xml:space="preserve">pharmacodynamic data, but established estimation methods – first-order</w:t>
+        <w:t xml:space="preserve">pharmacodynamic data, but established estimation methods, first-order</w:t>
       </w:r>
       <w:r>
         <w:t xml:space="preserve"> </w:t>
@@ -48,7 +48,7 @@
         <w:t xml:space="preserve"> </w:t>
       </w:r>
       <w:r>
-        <w:t xml:space="preserve">approximation expectation-maximization (SAEM) – scale poorly with</w:t>
+        <w:t xml:space="preserve">approximation expectation-maximization (SAEM), scale poorly with</w:t>
       </w:r>
       <w:r>
         <w:t xml:space="preserve"> </w:t>
@@ -277,31 +277,31 @@
         <w:t xml:space="preserve"> </w:t>
       </w:r>
       <w:r>
-        <w:t xml:space="preserve">between-subject variability, while we identify and resolve a</w:t>
-      </w:r>
-      <w:r>
-        <w:t xml:space="preserve"> </w:t>
-      </w:r>
-      <w:r>
-        <w:t xml:space="preserve">structural, cross-method identifiability limitation specific to</w:t>
-      </w:r>
-      <w:r>
-        <w:t xml:space="preserve"> </w:t>
-      </w:r>
-      <w:r>
-        <w:t xml:space="preserve">estimating variability on both Michaelis-Menten parameters</w:t>
-      </w:r>
-      <w:r>
-        <w:t xml:space="preserve"> </w:t>
-      </w:r>
-      <w:r>
-        <w:t xml:space="preserve">simultaneously. We further show that likelihood-ratio tests built on the</w:t>
-      </w:r>
-      <w:r>
-        <w:t xml:space="preserve"> </w:t>
-      </w:r>
-      <w:r>
-        <w:t xml:space="preserve">variational posterior’s recovered marginal likelihood are only valid for</w:t>
+        <w:t xml:space="preserve">between-subject variability, while we identify and resolve a structural,</w:t>
+      </w:r>
+      <w:r>
+        <w:t xml:space="preserve"> </w:t>
+      </w:r>
+      <w:r>
+        <w:t xml:space="preserve">cross-method identifiability limitation specific to estimating</w:t>
+      </w:r>
+      <w:r>
+        <w:t xml:space="preserve"> </w:t>
+      </w:r>
+      <w:r>
+        <w:t xml:space="preserve">variability on both Michaelis-Menten parameters simultaneously. We</w:t>
+      </w:r>
+      <w:r>
+        <w:t xml:space="preserve"> </w:t>
+      </w:r>
+      <w:r>
+        <w:t xml:space="preserve">further show that likelihood-ratio tests built on the variational</w:t>
+      </w:r>
+      <w:r>
+        <w:t xml:space="preserve"> </w:t>
+      </w:r>
+      <w:r>
+        <w:t xml:space="preserve">posterior’s recovered marginal likelihood are only valid for</w:t>
       </w:r>
       <w:r>
         <w:t xml:space="preserve"> </w:t>
@@ -373,19 +373,19 @@
         <w:t xml:space="preserve"> </w:t>
       </w:r>
       <w:r>
-        <w:t xml:space="preserve">structure – fixed effects and the distribution of between-subject random</w:t>
-      </w:r>
-      <w:r>
-        <w:t xml:space="preserve"> </w:t>
-      </w:r>
-      <w:r>
-        <w:t xml:space="preserve">effects – gives rise to individual-level observations, and they remain</w:t>
-      </w:r>
-      <w:r>
-        <w:t xml:space="preserve"> </w:t>
-      </w:r>
-      <w:r>
-        <w:t xml:space="preserve">the standard analytic tool across pharmacokinetics, pharmacodynamics, and</w:t>
+        <w:t xml:space="preserve">structure, fixed effects and the distribution of between-subject random</w:t>
+      </w:r>
+      <w:r>
+        <w:t xml:space="preserve"> </w:t>
+      </w:r>
+      <w:r>
+        <w:t xml:space="preserve">effects, gives rise to individual-level observations, and they remain the</w:t>
+      </w:r>
+      <w:r>
+        <w:t xml:space="preserve"> </w:t>
+      </w:r>
+      <w:r>
+        <w:t xml:space="preserve">standard analytic tool across pharmacokinetics, pharmacodynamics, and</w:t>
       </w:r>
       <w:r>
         <w:t xml:space="preserve"> </w:t>
@@ -603,7 +603,7 @@
         <w:t xml:space="preserve"> </w:t>
       </w:r>
       <w:r>
-        <w:t xml:space="preserve">that it systematically underestimates posterior variance – a general</w:t>
+        <w:t xml:space="preserve">that it systematically underestimates posterior variance, a general</w:t>
       </w:r>
       <w:r>
         <w:t xml:space="preserve"> </w:t>
@@ -639,28 +639,28 @@
         <w:t xml:space="preserve"> </w:t>
       </w:r>
       <w:r>
-        <w:t xml:space="preserve">(Tarek and Afonso; Li et al.; Baaz et al.)</w:t>
-      </w:r>
-      <w:r>
-        <w:t xml:space="preserve">. In the</w:t>
-      </w:r>
-      <w:r>
-        <w:t xml:space="preserve"> </w:t>
-      </w:r>
-      <w:r>
-        <w:t xml:space="preserve">NLME setting specifically, this translates into underestimated</w:t>
-      </w:r>
-      <w:r>
-        <w:t xml:space="preserve"> </w:t>
-      </w:r>
-      <w:r>
-        <w:t xml:space="preserve">between-subject variance components (commonly denoted Omega, or written</w:t>
-      </w:r>
-      <w:r>
-        <w:t xml:space="preserve"> </w:t>
-      </w:r>
-      <w:r>
-        <w:t xml:space="preserve">as the diagonal of a covariance matrix</w:t>
+        <w:t xml:space="preserve">(Tarek and Afonso 2026; Li et al. 2026; Baaz, Sjöberg, and Jirstrand 2026)</w:t>
+      </w:r>
+      <w:r>
+        <w:t xml:space="preserve">. In the NLME</w:t>
+      </w:r>
+      <w:r>
+        <w:t xml:space="preserve"> </w:t>
+      </w:r>
+      <w:r>
+        <w:t xml:space="preserve">setting specifically, this translates into underestimated between-subject</w:t>
+      </w:r>
+      <w:r>
+        <w:t xml:space="preserve"> </w:t>
+      </w:r>
+      <w:r>
+        <w:t xml:space="preserve">variance components (commonly denoted Omega, or written as the diagonal</w:t>
+      </w:r>
+      <w:r>
+        <w:t xml:space="preserve"> </w:t>
+      </w:r>
+      <w:r>
+        <w:t xml:space="preserve">of a covariance matrix</w:t>
       </w:r>
       <w:r>
         <w:t xml:space="preserve"> </w:t>
@@ -671,49 +671,49 @@
         </m:r>
       </m:oMath>
       <w:r>
-        <w:t xml:space="preserve">) – precisely the</w:t>
-      </w:r>
-      <w:r>
-        <w:t xml:space="preserve"> </w:t>
-      </w:r>
-      <w:r>
-        <w:t xml:space="preserve">quantity that most directly answers scientific questions about population</w:t>
-      </w:r>
-      <w:r>
-        <w:t xml:space="preserve"> </w:t>
-      </w:r>
-      <w:r>
-        <w:t xml:space="preserve">heterogeneity, and the quantity on which decisions such as covariate</w:t>
-      </w:r>
-      <w:r>
-        <w:t xml:space="preserve"> </w:t>
-      </w:r>
-      <w:r>
-        <w:t xml:space="preserve">inclusion are frequently based. While this failure mode has been noted in</w:t>
-      </w:r>
-      <w:r>
-        <w:t xml:space="preserve"> </w:t>
-      </w:r>
-      <w:r>
-        <w:t xml:space="preserve">passing in several places in the recent literature applying VI to NLME</w:t>
-      </w:r>
-      <w:r>
-        <w:t xml:space="preserve"> </w:t>
-      </w:r>
-      <w:r>
-        <w:t xml:space="preserve">models, it has not, to our knowledge, been systematically characterized:</w:t>
-      </w:r>
-      <w:r>
-        <w:t xml:space="preserve"> </w:t>
-      </w:r>
-      <w:r>
-        <w:t xml:space="preserve">under what conditions it arises, whether it can be corrected, and whether</w:t>
-      </w:r>
-      <w:r>
-        <w:t xml:space="preserve"> </w:t>
-      </w:r>
-      <w:r>
-        <w:t xml:space="preserve">correcting the point estimates of</w:t>
+        <w:t xml:space="preserve">), precisely the quantity that most</w:t>
+      </w:r>
+      <w:r>
+        <w:t xml:space="preserve"> </w:t>
+      </w:r>
+      <w:r>
+        <w:t xml:space="preserve">directly answers scientific questions about population heterogeneity, and</w:t>
+      </w:r>
+      <w:r>
+        <w:t xml:space="preserve"> </w:t>
+      </w:r>
+      <w:r>
+        <w:t xml:space="preserve">the quantity on which decisions such as covariate inclusion are</w:t>
+      </w:r>
+      <w:r>
+        <w:t xml:space="preserve"> </w:t>
+      </w:r>
+      <w:r>
+        <w:t xml:space="preserve">frequently based. While this failure mode has been noted in passing in</w:t>
+      </w:r>
+      <w:r>
+        <w:t xml:space="preserve"> </w:t>
+      </w:r>
+      <w:r>
+        <w:t xml:space="preserve">several places in the recent literature applying VI to NLME models, it</w:t>
+      </w:r>
+      <w:r>
+        <w:t xml:space="preserve"> </w:t>
+      </w:r>
+      <w:r>
+        <w:t xml:space="preserve">has not, to our knowledge, been systematically characterized: under what</w:t>
+      </w:r>
+      <w:r>
+        <w:t xml:space="preserve"> </w:t>
+      </w:r>
+      <w:r>
+        <w:t xml:space="preserve">conditions it arises, whether it can be corrected, and whether correcting</w:t>
+      </w:r>
+      <w:r>
+        <w:t xml:space="preserve"> </w:t>
+      </w:r>
+      <w:r>
+        <w:t xml:space="preserve">the point estimates of</w:t>
       </w:r>
       <w:r>
         <w:t xml:space="preserve"> </w:t>
@@ -727,19 +727,19 @@
         <w:t xml:space="preserve"> </w:t>
       </w:r>
       <w:r>
-        <w:t xml:space="preserve">is sufficient to make the</w:t>
-      </w:r>
-      <w:r>
-        <w:t xml:space="preserve"> </w:t>
-      </w:r>
-      <w:r>
-        <w:t xml:space="preserve">resulting fit trustworthy for the full range of downstream uses an NLME</w:t>
-      </w:r>
-      <w:r>
-        <w:t xml:space="preserve"> </w:t>
-      </w:r>
-      <w:r>
-        <w:t xml:space="preserve">model is put to – in particular, likelihood-ratio-based model selection.</w:t>
+        <w:t xml:space="preserve">is sufficient to make the resulting fit</w:t>
+      </w:r>
+      <w:r>
+        <w:t xml:space="preserve"> </w:t>
+      </w:r>
+      <w:r>
+        <w:t xml:space="preserve">trustworthy for the full range of downstream uses an NLME model is put</w:t>
+      </w:r>
+      <w:r>
+        <w:t xml:space="preserve"> </w:t>
+      </w:r>
+      <w:r>
+        <w:t xml:space="preserve">to, in particular likelihood-ratio-based model selection.</w:t>
       </w:r>
     </w:p>
     <w:p>
@@ -969,7 +969,7 @@
         <w:t xml:space="preserve"> </w:t>
       </w:r>
       <w:r>
-        <w:t xml:space="preserve">that the corrected point estimates – not just their relative</w:t>
+        <w:t xml:space="preserve">that the corrected point estimates, not just their relative</w:t>
       </w:r>
       <w:r>
         <w:t xml:space="preserve"> </w:t>
@@ -995,10 +995,7 @@
         </m:r>
       </m:oMath>
       <w:r>
-        <w:t xml:space="preserve"> </w:t>
-      </w:r>
-      <w:r>
-        <w:t xml:space="preserve">– are quantitatively trustworthy against</w:t>
+        <w:t xml:space="preserve">, are quantitatively trustworthy against</w:t>
       </w:r>
       <w:r>
         <w:t xml:space="preserve"> </w:t>
@@ -1064,13 +1061,13 @@
         <w:t xml:space="preserve"> </w:t>
       </w:r>
       <w:r>
-        <w:t xml:space="preserve">a structural identifiability limitation – consistent with standard</w:t>
-      </w:r>
-      <w:r>
-        <w:t xml:space="preserve"> </w:t>
-      </w:r>
-      <w:r>
-        <w:t xml:space="preserve">pharmacometric practice, not a VI-specific artifact – for estimating</w:t>
+        <w:t xml:space="preserve">a structural identifiability limitation, consistent with standard</w:t>
+      </w:r>
+      <w:r>
+        <w:t xml:space="preserve"> </w:t>
+      </w:r>
+      <w:r>
+        <w:t xml:space="preserve">pharmacometric practice and not a VI-specific artifact, for estimating</w:t>
       </w:r>
       <w:r>
         <w:t xml:space="preserve"> </w:t>
@@ -1124,7 +1121,7 @@
         <w:t xml:space="preserve"> </w:t>
       </w:r>
       <w:r>
-        <w:t xml:space="preserve">classical asymptotic theory – including the correct boundary-mixture</w:t>
+        <w:t xml:space="preserve">classical asymptotic theory, including the correct boundary-mixture</w:t>
       </w:r>
       <w:r>
         <w:t xml:space="preserve"> </w:t>
@@ -1139,10 +1136,7 @@
         <w:t xml:space="preserve">(Self and Liang 1987)</w:t>
       </w:r>
       <w:r>
-        <w:t xml:space="preserve"> </w:t>
-      </w:r>
-      <w:r>
-        <w:t xml:space="preserve">– does not account for, while an amortized</w:t>
+        <w:t xml:space="preserve">, does not account for, while an amortized</w:t>
       </w:r>
       <w:r>
         <w:t xml:space="preserve"> </w:t>
@@ -1179,32 +1173,6 @@
       </w:r>
       <w:r>
         <w:t xml:space="preserve">the correctness of a fit cannot otherwise be directly verified.</w:t>
-      </w:r>
-    </w:p>
-    <w:p>
-      <w:pPr>
-        <w:pStyle w:val="FirstParagraph"/>
-      </w:pPr>
-      <w:r>
-        <w:t xml:space="preserve">[PLACEHOLDER: nlmixr2/NONMEM – the accuracy side of the FOCEI/SAEM</w:t>
-      </w:r>
-      <w:r>
-        <w:t xml:space="preserve"> </w:t>
-      </w:r>
-      <w:r>
-        <w:t xml:space="preserve">comparison (contribution 2 above) is now complete; a runtime comparison</w:t>
-      </w:r>
-      <w:r>
-        <w:t xml:space="preserve"> </w:t>
-      </w:r>
-      <w:r>
-        <w:t xml:space="preserve">is not yet included (see Methods, Results, and Limitations below) and</w:t>
-      </w:r>
-      <w:r>
-        <w:t xml:space="preserve"> </w:t>
-      </w:r>
-      <w:r>
-        <w:t xml:space="preserve">should be added as an explicit contribution once available.]</w:t>
       </w:r>
     </w:p>
     <w:bookmarkEnd w:id="21"/>
@@ -4057,7 +4025,7 @@
         <w:t xml:space="preserve"> </w:t>
       </w:r>
       <w:r>
-        <w:t xml:space="preserve">fresh per-subject optimization – the property that makes amortized VI</w:t>
+        <w:t xml:space="preserve">fresh per-subject optimization, the property that makes amortized VI</w:t>
       </w:r>
       <w:r>
         <w:t xml:space="preserve"> </w:t>
@@ -4699,13 +4667,13 @@
         <w:t xml:space="preserve"> </w:t>
       </w:r>
       <w:r>
-        <w:t xml:space="preserve">Gaussian/flow); as detailed in the Results, one configuration</w:t>
-      </w:r>
-      <w:r>
-        <w:t xml:space="preserve"> </w:t>
-      </w:r>
-      <w:r>
-        <w:t xml:space="preserve">(amortized + flow) is unstable and excluded from headline results.</w:t>
+        <w:t xml:space="preserve">Gaussian/flow); as detailed in the Results, one configuration (amortized</w:t>
+      </w:r>
+      <w:r>
+        <w:t xml:space="preserve"> </w:t>
+      </w:r>
+      <w:r>
+        <w:t xml:space="preserve">+ flow) is unstable and excluded from headline results.</w:t>
       </w:r>
     </w:p>
     <w:bookmarkEnd w:id="30"/>
@@ -5342,79 +5310,73 @@
         <w:t xml:space="preserve"> </w:t>
       </w:r>
       <w:r>
-        <w:t xml:space="preserve">without a random effect – both because placing independent</w:t>
-      </w:r>
-      <w:r>
-        <w:t xml:space="preserve"> </w:t>
-      </w:r>
-      <w:r>
-        <w:t xml:space="preserve">between-subject variability on both Michaelis-Menten parameters</w:t>
-      </w:r>
-      <w:r>
-        <w:t xml:space="preserve"> </w:t>
-      </w:r>
-      <w:r>
-        <w:t xml:space="preserve">simultaneously is a recognized cross-method identifiability difficulty in</w:t>
-      </w:r>
-      <w:r>
-        <w:t xml:space="preserve"> </w:t>
-      </w:r>
-      <w:r>
-        <w:t xml:space="preserve">nonlinear mixed-effects modeling of saturable kinetics, not specific to</w:t>
-      </w:r>
-      <w:r>
-        <w:t xml:space="preserve"> </w:t>
-      </w:r>
-      <w:r>
-        <w:t xml:space="preserve">variational inference, and because this was directly confirmed</w:t>
-      </w:r>
-      <w:r>
-        <w:t xml:space="preserve"> </w:t>
-      </w:r>
-      <w:r>
-        <w:t xml:space="preserve">empirically in preliminary analyses (see Results). The dosing and</w:t>
-      </w:r>
-      <w:r>
-        <w:t xml:space="preserve"> </w:t>
-      </w:r>
-      <w:r>
-        <w:t xml:space="preserve">sampling design (dose and an observation window spanning approximately</w:t>
-      </w:r>
-      <w:r>
-        <w:t xml:space="preserve"> </w:t>
-      </w:r>
-      <w:r>
-        <w:t xml:space="preserve">60 hours) was chosen specifically to ensure the simulated concentration</w:t>
-      </w:r>
-      <w:r>
-        <w:t xml:space="preserve"> </w:t>
-      </w:r>
-      <w:r>
-        <w:t xml:space="preserve">trajectory crosses from the fully saturated regime into the first-order</w:t>
-      </w:r>
-      <w:r>
-        <w:t xml:space="preserve"> </w:t>
-      </w:r>
-      <w:r>
-        <w:t xml:space="preserve">elimination regime within the observation window; simulation confirmed</w:t>
-      </w:r>
-      <w:r>
-        <w:t xml:space="preserve"> </w:t>
-      </w:r>
-      <w:r>
-        <w:t xml:space="preserve">that a substantially shorter window remains entirely within the</w:t>
-      </w:r>
-      <w:r>
-        <w:t xml:space="preserve"> </w:t>
-      </w:r>
-      <w:r>
-        <w:t xml:space="preserve">saturated regime, in which the Michaelis-Menten equation is structurally</w:t>
-      </w:r>
-      <w:r>
-        <w:t xml:space="preserve"> </w:t>
-      </w:r>
-      <w:r>
-        <w:t xml:space="preserve">insensitive to</w:t>
+        <w:t xml:space="preserve">without a random effect, both because placing independent between-subject</w:t>
+      </w:r>
+      <w:r>
+        <w:t xml:space="preserve"> </w:t>
+      </w:r>
+      <w:r>
+        <w:t xml:space="preserve">variability on both Michaelis-Menten parameters simultaneously is a</w:t>
+      </w:r>
+      <w:r>
+        <w:t xml:space="preserve"> </w:t>
+      </w:r>
+      <w:r>
+        <w:t xml:space="preserve">recognized cross-method identifiability difficulty in nonlinear</w:t>
+      </w:r>
+      <w:r>
+        <w:t xml:space="preserve"> </w:t>
+      </w:r>
+      <w:r>
+        <w:t xml:space="preserve">mixed-effects modeling of saturable kinetics, not specific to variational</w:t>
+      </w:r>
+      <w:r>
+        <w:t xml:space="preserve"> </w:t>
+      </w:r>
+      <w:r>
+        <w:t xml:space="preserve">inference, and because this was directly confirmed empirically in</w:t>
+      </w:r>
+      <w:r>
+        <w:t xml:space="preserve"> </w:t>
+      </w:r>
+      <w:r>
+        <w:t xml:space="preserve">preliminary analyses (see Results). The dosing and sampling design (dose</w:t>
+      </w:r>
+      <w:r>
+        <w:t xml:space="preserve"> </w:t>
+      </w:r>
+      <w:r>
+        <w:t xml:space="preserve">and an observation window spanning approximately 60 hours) was chosen</w:t>
+      </w:r>
+      <w:r>
+        <w:t xml:space="preserve"> </w:t>
+      </w:r>
+      <w:r>
+        <w:t xml:space="preserve">specifically to ensure the simulated concentration trajectory crosses</w:t>
+      </w:r>
+      <w:r>
+        <w:t xml:space="preserve"> </w:t>
+      </w:r>
+      <w:r>
+        <w:t xml:space="preserve">from the fully saturated regime into the first-order elimination regime</w:t>
+      </w:r>
+      <w:r>
+        <w:t xml:space="preserve"> </w:t>
+      </w:r>
+      <w:r>
+        <w:t xml:space="preserve">within the observation window; simulation confirmed that a substantially</w:t>
+      </w:r>
+      <w:r>
+        <w:t xml:space="preserve"> </w:t>
+      </w:r>
+      <w:r>
+        <w:t xml:space="preserve">shorter window remains entirely within the saturated regime, in which the</w:t>
+      </w:r>
+      <w:r>
+        <w:t xml:space="preserve"> </w:t>
+      </w:r>
+      <w:r>
+        <w:t xml:space="preserve">Michaelis-Menten equation is structurally insensitive to</w:t>
       </w:r>
       <w:r>
         <w:t xml:space="preserve"> </w:t>
@@ -5434,7 +5396,13 @@
         </m:sSub>
       </m:oMath>
       <w:r>
-        <w:t xml:space="preserve">, and does not permit identification of</w:t>
+        <w:t xml:space="preserve">, and does</w:t>
+      </w:r>
+      <w:r>
+        <w:t xml:space="preserve"> </w:t>
+      </w:r>
+      <w:r>
+        <w:t xml:space="preserve">not permit identification of</w:t>
       </w:r>
       <w:r>
         <w:t xml:space="preserve"> </w:t>
@@ -5454,19 +5422,13 @@
         </m:sSub>
       </m:oMath>
       <w:r>
-        <w:t xml:space="preserve">’s</w:t>
-      </w:r>
-      <w:r>
-        <w:t xml:space="preserve"> </w:t>
-      </w:r>
-      <w:r>
-        <w:t xml:space="preserve">population value at all, independent of any variational-inference</w:t>
-      </w:r>
-      <w:r>
-        <w:t xml:space="preserve"> </w:t>
-      </w:r>
-      <w:r>
-        <w:t xml:space="preserve">consideration.</w:t>
+        <w:t xml:space="preserve">’s population value at all,</w:t>
+      </w:r>
+      <w:r>
+        <w:t xml:space="preserve"> </w:t>
+      </w:r>
+      <w:r>
+        <w:t xml:space="preserve">independent of any variational-inference consideration.</w:t>
       </w:r>
     </w:p>
     <w:p>
@@ -5549,13 +5511,13 @@
         <w:t xml:space="preserve"> </w:t>
       </w:r>
       <w:r>
-        <w:t xml:space="preserve">where – unlike simulation – no ground truth is available and the</w:t>
-      </w:r>
-      <w:r>
-        <w:t xml:space="preserve"> </w:t>
-      </w:r>
-      <w:r>
-        <w:t xml:space="preserve">signature to look for is instead internal consistency: whether</w:t>
+        <w:t xml:space="preserve">where, unlike simulation, no ground truth is available and the signature</w:t>
+      </w:r>
+      <w:r>
+        <w:t xml:space="preserve"> </w:t>
+      </w:r>
+      <w:r>
+        <w:t xml:space="preserve">to look for is instead internal consistency: whether</w:t>
       </w:r>
       <w:r>
         <w:t xml:space="preserve"> </w:t>
@@ -5615,13 +5577,13 @@
         <w:t xml:space="preserve"> </w:t>
       </w:r>
       <w:r>
-        <w:t xml:space="preserve">on the identical dataset, and</w:t>
-      </w:r>
-      <w:r>
-        <w:t xml:space="preserve"> </w:t>
-      </w:r>
-      <w:r>
-        <w:t xml:space="preserve">whether fixed-effect estimates are externally plausible.</w:t>
+        <w:t xml:space="preserve">on the identical dataset, and whether</w:t>
+      </w:r>
+      <w:r>
+        <w:t xml:space="preserve"> </w:t>
+      </w:r>
+      <w:r>
+        <w:t xml:space="preserve">fixed-effect estimates are externally plausible.</w:t>
       </w:r>
     </w:p>
     <w:p>
@@ -5853,19 +5815,19 @@
         <w:t xml:space="preserve"> </w:t>
       </w:r>
       <w:r>
-        <w:t xml:space="preserve">is validated by deliberately comparing well-converged and</w:t>
-      </w:r>
-      <w:r>
-        <w:t xml:space="preserve"> </w:t>
-      </w:r>
-      <w:r>
-        <w:t xml:space="preserve">deliberately under-trained fits on identical simulated data and testing</w:t>
-      </w:r>
-      <w:r>
-        <w:t xml:space="preserve"> </w:t>
-      </w:r>
-      <w:r>
-        <w:t xml:space="preserve">whether ESS separates the two groups.</w:t>
+        <w:t xml:space="preserve">is validated by deliberately comparing well-converged and deliberately</w:t>
+      </w:r>
+      <w:r>
+        <w:t xml:space="preserve"> </w:t>
+      </w:r>
+      <w:r>
+        <w:t xml:space="preserve">under-trained fits on identical simulated data and testing whether ESS</w:t>
+      </w:r>
+      <w:r>
+        <w:t xml:space="preserve"> </w:t>
+      </w:r>
+      <w:r>
+        <w:t xml:space="preserve">separates the two groups.</w:t>
       </w:r>
     </w:p>
     <w:bookmarkEnd w:id="35"/>
@@ -6555,10 +6517,7 @@
         <w:t xml:space="preserve">OneCmtOral</w:t>
       </w:r>
       <w:r>
-        <w:t xml:space="preserve"> </w:t>
-      </w:r>
-      <w:r>
-        <w:t xml:space="preserve">– identical parameterization (</w:t>
+        <w:t xml:space="preserve">: identical parameterization (</w:t>
       </w:r>
       <m:oMath>
         <m:r>
@@ -6759,37 +6718,31 @@
         <w:t xml:space="preserve"> </w:t>
       </w:r>
       <w:r>
-        <w:t xml:space="preserve">[PLACEHOLDER: nlmixr2/NONMEM – runtime is intended to be measured as</w:t>
-      </w:r>
-      <w:r>
-        <w:t xml:space="preserve"> </w:t>
-      </w:r>
-      <w:r>
-        <w:t xml:space="preserve">process CPU time (not wall-clock) for both the R and Python processes,</w:t>
-      </w:r>
-      <w:r>
-        <w:t xml:space="preserve"> </w:t>
-      </w:r>
-      <w:r>
-        <w:t xml:space="preserve">consistent with the timing methodology used throughout this work; at the</w:t>
-      </w:r>
-      <w:r>
-        <w:t xml:space="preserve"> </w:t>
-      </w:r>
-      <w:r>
-        <w:t xml:space="preserve">time of writing, process CPU time was not correctly captured for the</w:t>
-      </w:r>
-      <w:r>
-        <w:t xml:space="preserve"> </w:t>
-      </w:r>
-      <w:r>
-        <w:t xml:space="preserve">FOCEI/SAEM fits in the results reported below (see Results and</w:t>
-      </w:r>
-      <w:r>
-        <w:t xml:space="preserve"> </w:t>
-      </w:r>
-      <w:r>
-        <w:t xml:space="preserve">Limitations), so no runtime comparison is yet included.]</w:t>
+        <w:t xml:space="preserve">Runtime is measured as process CPU time, not wall-clock time, for the</w:t>
+      </w:r>
+      <w:r>
+        <w:t xml:space="preserve"> </w:t>
+      </w:r>
+      <w:r>
+        <w:t xml:space="preserve">variational inference fits, consistent with the timing methodology used</w:t>
+      </w:r>
+      <w:r>
+        <w:t xml:space="preserve"> </w:t>
+      </w:r>
+      <w:r>
+        <w:t xml:space="preserve">throughout this work; process CPU time for the FOCEI and SAEM fits was</w:t>
+      </w:r>
+      <w:r>
+        <w:t xml:space="preserve"> </w:t>
+      </w:r>
+      <w:r>
+        <w:t xml:space="preserve">not correctly captured in the current results, so a runtime comparison</w:t>
+      </w:r>
+      <w:r>
+        <w:t xml:space="preserve"> </w:t>
+      </w:r>
+      <w:r>
+        <w:t xml:space="preserve">is not reported (see Limitations).</w:t>
       </w:r>
     </w:p>
     <w:bookmarkEnd w:id="39"/>
@@ -6846,13 +6799,10 @@
         <w:t xml:space="preserve">(Fidler et al. 2019)</w:t>
       </w:r>
       <w:r>
-        <w:t xml:space="preserve">. [PLACEHOLDER: nlmixr2/NONMEM – exact R</w:t>
-      </w:r>
-      <w:r>
-        <w:t xml:space="preserve"> </w:t>
-      </w:r>
-      <w:r>
-        <w:t xml:space="preserve">and</w:t>
+        <w:t xml:space="preserve"> </w:t>
+      </w:r>
+      <w:r>
+        <w:t xml:space="preserve">(version 7.0.1, with</w:t>
       </w:r>
       <w:r>
         <w:t xml:space="preserve"> </w:t>
@@ -6861,13 +6811,19 @@
         <w:rPr>
           <w:rStyle w:val="VerbatimChar"/>
         </w:rPr>
-        <w:t xml:space="preserve">nlmixr2</w:t>
-      </w:r>
-      <w:r>
-        <w:t xml:space="preserve"> </w:t>
-      </w:r>
-      <w:r>
-        <w:t xml:space="preserve">package version numbers, e.g. via</w:t>
+        <w:t xml:space="preserve">nlmixr2est</w:t>
+      </w:r>
+      <w:r>
+        <w:t xml:space="preserve"> </w:t>
+      </w:r>
+      <w:r>
+        <w:t xml:space="preserve">7.0.2</w:t>
+      </w:r>
+      <w:r>
+        <w:t xml:space="preserve"> </w:t>
+      </w:r>
+      <w:r>
+        <w:t xml:space="preserve">and</w:t>
       </w:r>
       <w:r>
         <w:t xml:space="preserve"> </w:t>
@@ -6876,25 +6832,19 @@
         <w:rPr>
           <w:rStyle w:val="VerbatimChar"/>
         </w:rPr>
-        <w:t xml:space="preserve">sessionInfo()</w:t>
-      </w:r>
-      <w:r>
-        <w:t xml:space="preserve"> </w:t>
-      </w:r>
-      <w:r>
-        <w:t xml:space="preserve">/</w:t>
-      </w:r>
-      <w:r>
-        <w:t xml:space="preserve"> </w:t>
-      </w:r>
-      <w:r>
-        <w:rPr>
-          <w:rStyle w:val="VerbatimChar"/>
-        </w:rPr>
-        <w:t xml:space="preserve">packageVersion("nlmixr2")</w:t>
-      </w:r>
-      <w:r>
-        <w:t xml:space="preserve">, to be added once confirmed.]</w:t>
+        <w:t xml:space="preserve">rxode2</w:t>
+      </w:r>
+      <w:r>
+        <w:t xml:space="preserve"> </w:t>
+      </w:r>
+      <w:r>
+        <w:t xml:space="preserve">5.1.6) under R version 4.5.3 (aarch64-apple-darwin20) on</w:t>
+      </w:r>
+      <w:r>
+        <w:t xml:space="preserve"> </w:t>
+      </w:r>
+      <w:r>
+        <w:t xml:space="preserve">macOS.</w:t>
       </w:r>
     </w:p>
     <w:bookmarkEnd w:id="40"/>
@@ -7048,13 +6998,13 @@
         <w:t xml:space="preserve"> </w:t>
       </w:r>
       <w:r>
-        <w:t xml:space="preserve">the phenomenon is specific to variance-component estimation rather than</w:t>
-      </w:r>
-      <w:r>
-        <w:t xml:space="preserve"> </w:t>
-      </w:r>
-      <w:r>
-        <w:t xml:space="preserve">a general estimation problem with the variational approach</w:t>
+        <w:t xml:space="preserve">the phenomenon is specific to variance-component estimation rather than a</w:t>
+      </w:r>
+      <w:r>
+        <w:t xml:space="preserve"> </w:t>
+      </w:r>
+      <w:r>
+        <w:t xml:space="preserve">general estimation problem with the variational approach</w:t>
       </w:r>
       <w:r>
         <w:t xml:space="preserve"> </w:t>
@@ -16428,13 +16378,13 @@
         <w:pStyle w:val="BodyText"/>
       </w:pPr>
       <w:r>
-        <w:t xml:space="preserve">One posterior configuration – amortized posterior combined with the</w:t>
-      </w:r>
-      <w:r>
-        <w:t xml:space="preserve"> </w:t>
-      </w:r>
-      <w:r>
-        <w:t xml:space="preserve">normalizing-flow family – is unstable across every tested value of</w:t>
+        <w:t xml:space="preserve">One posterior configuration, amortized posterior combined with the</w:t>
+      </w:r>
+      <w:r>
+        <w:t xml:space="preserve"> </w:t>
+      </w:r>
+      <w:r>
+        <w:t xml:space="preserve">normalizing-flow family, is unstable across every tested value of</w:t>
       </w:r>
       <w:r>
         <w:t xml:space="preserve"> </w:t>
@@ -16448,7 +16398,13 @@
         <w:t xml:space="preserve"> </w:t>
       </w:r>
       <w:r>
-        <w:t xml:space="preserve">and is excluded from the results above. Rather than a</w:t>
+        <w:t xml:space="preserve">and</w:t>
+      </w:r>
+      <w:r>
+        <w:t xml:space="preserve"> </w:t>
+      </w:r>
+      <w:r>
+        <w:t xml:space="preserve">is excluded from the results above. Rather than a</w:t>
       </w:r>
       <w:r>
         <w:t xml:space="preserve"> </w:t>
@@ -16468,19 +16424,19 @@
         </m:r>
       </m:oMath>
       <w:r>
-        <w:t xml:space="preserve">-specific</w:t>
-      </w:r>
-      <w:r>
-        <w:t xml:space="preserve"> </w:t>
-      </w:r>
-      <w:r>
-        <w:t xml:space="preserve">problem, this combination shows a comparable rate of flagged,</w:t>
-      </w:r>
-      <w:r>
-        <w:t xml:space="preserve"> </w:t>
-      </w:r>
-      <w:r>
-        <w:t xml:space="preserve">substantially divergent fits at</w:t>
+        <w:t xml:space="preserve">-specific problem,</w:t>
+      </w:r>
+      <w:r>
+        <w:t xml:space="preserve"> </w:t>
+      </w:r>
+      <w:r>
+        <w:t xml:space="preserve">this combination shows a comparable rate of flagged, substantially</w:t>
+      </w:r>
+      <w:r>
+        <w:t xml:space="preserve"> </w:t>
+      </w:r>
+      <w:r>
+        <w:t xml:space="preserve">divergent fits at</w:t>
       </w:r>
       <w:r>
         <w:t xml:space="preserve"> </w:t>
@@ -16557,67 +16513,76 @@
         <w:t xml:space="preserve"> </w:t>
       </w:r>
       <w:r>
-        <w:t xml:space="preserve">changes the character of the failure (from occasional gross</w:t>
-      </w:r>
-      <w:r>
-        <w:t xml:space="preserve"> </w:t>
-      </w:r>
-      <w:r>
-        <w:t xml:space="preserve">divergence to more consistent convergence onto a stable but incorrect</w:t>
-      </w:r>
-      <w:r>
-        <w:t xml:space="preserve"> </w:t>
-      </w:r>
-      <w:r>
-        <w:t xml:space="preserve">estimate) without reducing its frequency. We attribute this to the</w:t>
-      </w:r>
-      <w:r>
-        <w:t xml:space="preserve"> </w:t>
-      </w:r>
-      <w:r>
-        <w:t xml:space="preserve">amortized encoder’s output serving a double role under this</w:t>
-      </w:r>
-      <w:r>
-        <w:t xml:space="preserve"> </w:t>
-      </w:r>
-      <w:r>
-        <w:t xml:space="preserve">configuration – simultaneously defining the flow’s base distribution and</w:t>
-      </w:r>
-      <w:r>
-        <w:t xml:space="preserve"> </w:t>
-      </w:r>
-      <w:r>
-        <w:t xml:space="preserve">its conditioning input – creating a moving optimization target not</w:t>
-      </w:r>
-      <w:r>
-        <w:t xml:space="preserve"> </w:t>
-      </w:r>
-      <w:r>
-        <w:t xml:space="preserve">present when either the posterior is not amortized or the family is not</w:t>
-      </w:r>
-      <w:r>
-        <w:t xml:space="preserve"> </w:t>
-      </w:r>
-      <w:r>
-        <w:t xml:space="preserve">a flow.</w:t>
-      </w:r>
-      <w:r>
-        <w:t xml:space="preserve"> </w:t>
-      </w:r>
-      <w:r>
-        <w:t xml:space="preserve">(PLACEHOLDER: a preliminary architectural variant decoupling</w:t>
-      </w:r>
-      <w:r>
-        <w:t xml:space="preserve"> </w:t>
-      </w:r>
-      <w:r>
-        <w:t xml:space="preserve">these two roles, following the design used by Arruda et al. 2024, is</w:t>
-      </w:r>
-      <w:r>
-        <w:t xml:space="preserve"> </w:t>
-      </w:r>
-      <w:r>
-        <w:t xml:space="preserve">discussed as future work below.)</w:t>
+        <w:t xml:space="preserve">changes the</w:t>
+      </w:r>
+      <w:r>
+        <w:t xml:space="preserve"> </w:t>
+      </w:r>
+      <w:r>
+        <w:t xml:space="preserve">character of the failure (from occasional gross divergence to more</w:t>
+      </w:r>
+      <w:r>
+        <w:t xml:space="preserve"> </w:t>
+      </w:r>
+      <w:r>
+        <w:t xml:space="preserve">consistent convergence onto a stable but incorrect estimate) without</w:t>
+      </w:r>
+      <w:r>
+        <w:t xml:space="preserve"> </w:t>
+      </w:r>
+      <w:r>
+        <w:t xml:space="preserve">reducing its frequency. We attribute this to the amortized encoder’s</w:t>
+      </w:r>
+      <w:r>
+        <w:t xml:space="preserve"> </w:t>
+      </w:r>
+      <w:r>
+        <w:t xml:space="preserve">output serving a double role under this configuration, simultaneously</w:t>
+      </w:r>
+      <w:r>
+        <w:t xml:space="preserve"> </w:t>
+      </w:r>
+      <w:r>
+        <w:t xml:space="preserve">defining the flow’s base distribution and its conditioning input,</w:t>
+      </w:r>
+      <w:r>
+        <w:t xml:space="preserve"> </w:t>
+      </w:r>
+      <w:r>
+        <w:t xml:space="preserve">creating a moving optimization target not present when either the</w:t>
+      </w:r>
+      <w:r>
+        <w:t xml:space="preserve"> </w:t>
+      </w:r>
+      <w:r>
+        <w:t xml:space="preserve">posterior is not amortized or the family is not a flow. A preliminary</w:t>
+      </w:r>
+      <w:r>
+        <w:t xml:space="preserve"> </w:t>
+      </w:r>
+      <w:r>
+        <w:t xml:space="preserve">architectural variant decoupling these two roles, following the design</w:t>
+      </w:r>
+      <w:r>
+        <w:t xml:space="preserve"> </w:t>
+      </w:r>
+      <w:r>
+        <w:t xml:space="preserve">used by</w:t>
+      </w:r>
+      <w:r>
+        <w:t xml:space="preserve"> </w:t>
+      </w:r>
+      <w:r>
+        <w:t xml:space="preserve">Arruda et al. (2024)</w:t>
+      </w:r>
+      <w:r>
+        <w:t xml:space="preserve">, is discussed as future work in the</w:t>
+      </w:r>
+      <w:r>
+        <w:t xml:space="preserve"> </w:t>
+      </w:r>
+      <w:r>
+        <w:t xml:space="preserve">Discussion.</w:t>
       </w:r>
     </w:p>
     <w:bookmarkEnd w:id="55"/>
@@ -16827,7 +16792,7 @@
         <w:t xml:space="preserve"> </w:t>
       </w:r>
       <w:r>
-        <w:t xml:space="preserve">remained modest throughout – a pattern consistent with a genuine</w:t>
+        <w:t xml:space="preserve">remained modest throughout, a pattern consistent with a genuine</w:t>
       </w:r>
       <w:r>
         <w:t xml:space="preserve"> </w:t>
@@ -16982,6 +16947,26 @@
       </w:r>
       <w:r>
         <w:t xml:space="preserve">seen in the linear tier reproduces on</w:t>
+      </w:r>
+      <w:r>
+        <w:t xml:space="preserve"> </w:t>
+      </w:r>
+      <m:oMath>
+        <m:sSub>
+          <m:e>
+            <m:r>
+              <m:t>Ω</m:t>
+            </m:r>
+          </m:e>
+          <m:sub>
+            <m:r>
+              <m:t>V</m:t>
+            </m:r>
+          </m:sub>
+        </m:sSub>
+      </m:oMath>
+      <w:r>
+        <w:t xml:space="preserve">;</w:t>
       </w:r>
       <w:r>
         <w:t xml:space="preserve"> </w:t>
@@ -17016,33 +17001,56 @@
         </m:sSub>
       </m:oMath>
       <w:r>
-        <w:t xml:space="preserve"> </w:t>
-      </w:r>
-      <w:r>
-        <w:t xml:space="preserve">and</w:t>
+        <w:t xml:space="preserve">’s</w:t>
+      </w:r>
+      <w:r>
+        <w:t xml:space="preserve"> </w:t>
+      </w:r>
+      <w:r>
+        <w:t xml:space="preserve">bias is small and essentially flat across</w:t>
       </w:r>
       <w:r>
         <w:t xml:space="preserve"> </w:t>
       </w:r>
       <m:oMath>
-        <m:sSub>
-          <m:e>
-            <m:r>
-              <m:t>Ω</m:t>
-            </m:r>
-          </m:e>
-          <m:sub>
-            <m:r>
-              <m:t>V</m:t>
-            </m:r>
-          </m:sub>
-        </m:sSub>
+        <m:r>
+          <m:t>K</m:t>
+        </m:r>
       </m:oMath>
       <w:r>
         <w:t xml:space="preserve"> </w:t>
       </w:r>
       <w:r>
-        <w:t xml:space="preserve">(</w:t>
+        <w:t xml:space="preserve">in this design, with</w:t>
+      </w:r>
+      <w:r>
+        <w:t xml:space="preserve"> </w:t>
+      </w:r>
+      <w:r>
+        <w:t xml:space="preserve">little shrinkage at</w:t>
+      </w:r>
+      <w:r>
+        <w:t xml:space="preserve"> </w:t>
+      </w:r>
+      <m:oMath>
+        <m:r>
+          <m:t>K</m:t>
+        </m:r>
+        <m:r>
+          <m:rPr>
+            <m:sty m:val="p"/>
+          </m:rPr>
+          <m:t>=</m:t>
+        </m:r>
+        <m:r>
+          <m:t>1</m:t>
+        </m:r>
+      </m:oMath>
+      <w:r>
+        <w:t xml:space="preserve"> </w:t>
+      </w:r>
+      <w:r>
+        <w:t xml:space="preserve">to correct (</w:t>
       </w:r>
       <w:hyperlink w:anchor="fig-phase1-nonlinear">
         <w:r>
@@ -19619,13 +19627,13 @@
         <w:t xml:space="preserve"> </w:t>
       </w:r>
       <w:r>
-        <w:t xml:space="preserve">model and found a distinct, substantial instability – not the</w:t>
-      </w:r>
-      <w:r>
-        <w:t xml:space="preserve"> </w:t>
-      </w:r>
-      <w:r>
-        <w:t xml:space="preserve">amortized-flow instability described above, since no flow is involved –</w:t>
+        <w:t xml:space="preserve">model and found a distinct, substantial instability, not the</w:t>
+      </w:r>
+      <w:r>
+        <w:t xml:space="preserve"> </w:t>
+      </w:r>
+      <w:r>
+        <w:t xml:space="preserve">amortized-flow instability described above, since no flow is involved,</w:t>
       </w:r>
       <w:r>
         <w:t xml:space="preserve"> </w:t>
@@ -19671,19 +19679,19 @@
         <w:t xml:space="preserve"> </w:t>
       </w:r>
       <w:r>
-        <w:t xml:space="preserve">budget. [PLACEHOLDER: this result is discussed further, with a working</w:t>
-      </w:r>
-      <w:r>
-        <w:t xml:space="preserve"> </w:t>
-      </w:r>
-      <w:r>
-        <w:t xml:space="preserve">hypothesis, in the Discussion below; results using the amortized</w:t>
-      </w:r>
-      <w:r>
-        <w:t xml:space="preserve"> </w:t>
-      </w:r>
-      <w:r>
-        <w:t xml:space="preserve">posterior on this model are excluded from the table and figure above.]</w:t>
+        <w:t xml:space="preserve">budget. Results using the amortized posterior on this model are excluded</w:t>
+      </w:r>
+      <w:r>
+        <w:t xml:space="preserve"> </w:t>
+      </w:r>
+      <w:r>
+        <w:t xml:space="preserve">from the table and figure above and discussed further, with a working</w:t>
+      </w:r>
+      <w:r>
+        <w:t xml:space="preserve"> </w:t>
+      </w:r>
+      <w:r>
+        <w:t xml:space="preserve">hypothesis, in the Discussion below.</w:t>
       </w:r>
     </w:p>
     <w:bookmarkEnd w:id="61"/>
@@ -19767,25 +19775,25 @@
         <w:t xml:space="preserve"> </w:t>
       </w:r>
       <w:r>
-        <w:t xml:space="preserve">on the identical dataset, with the clearance random effect</w:t>
-      </w:r>
-      <w:r>
-        <w:t xml:space="preserve"> </w:t>
-      </w:r>
-      <w:r>
-        <w:t xml:space="preserve">showing the least shrinkage of the three, consistent with clearance</w:t>
-      </w:r>
-      <w:r>
-        <w:t xml:space="preserve"> </w:t>
-      </w:r>
-      <w:r>
-        <w:t xml:space="preserve">being the most robustly identified parameter throughout the simulated</w:t>
-      </w:r>
-      <w:r>
-        <w:t xml:space="preserve"> </w:t>
-      </w:r>
-      <w:r>
-        <w:t xml:space="preserve">results above (</w:t>
+        <w:t xml:space="preserve">on the identical dataset, with the clearance random effect showing</w:t>
+      </w:r>
+      <w:r>
+        <w:t xml:space="preserve"> </w:t>
+      </w:r>
+      <w:r>
+        <w:t xml:space="preserve">the least shrinkage of the three, consistent with clearance being the</w:t>
+      </w:r>
+      <w:r>
+        <w:t xml:space="preserve"> </w:t>
+      </w:r>
+      <w:r>
+        <w:t xml:space="preserve">most robustly identified parameter throughout the simulated results above</w:t>
+      </w:r>
+      <w:r>
+        <w:t xml:space="preserve"> </w:t>
+      </w:r>
+      <w:r>
+        <w:t xml:space="preserve">(</w:t>
       </w:r>
       <w:hyperlink w:anchor="fig-realdata-k1-vs-khigh">
         <w:r>
@@ -19813,25 +19821,25 @@
         </w:r>
       </w:hyperlink>
       <w:r>
-        <w:t xml:space="preserve">). On warfarin, fixed-effect estimates for</w:t>
-      </w:r>
-      <w:r>
-        <w:t xml:space="preserve"> </w:t>
-      </w:r>
-      <w:r>
-        <w:t xml:space="preserve">clearance and volume of distribution fall inside the published 95%</w:t>
-      </w:r>
-      <w:r>
-        <w:t xml:space="preserve"> </w:t>
-      </w:r>
-      <w:r>
-        <w:t xml:space="preserve">confidence</w:t>
-      </w:r>
-      <w:r>
-        <w:t xml:space="preserve"> </w:t>
-      </w:r>
-      <w:r>
-        <w:t xml:space="preserve">intervals of an independently fitted FOCEI model on the same data</w:t>
+        <w:t xml:space="preserve">). On warfarin,</w:t>
+      </w:r>
+      <w:r>
+        <w:t xml:space="preserve"> </w:t>
+      </w:r>
+      <w:r>
+        <w:t xml:space="preserve">fixed-effect estimates for clearance and volume of distribution fall</w:t>
+      </w:r>
+      <w:r>
+        <w:t xml:space="preserve"> </w:t>
+      </w:r>
+      <w:r>
+        <w:t xml:space="preserve">inside the published 95% confidence intervals of an independently fitted</w:t>
+      </w:r>
+      <w:r>
+        <w:t xml:space="preserve"> </w:t>
+      </w:r>
+      <w:r>
+        <w:t xml:space="preserve">FOCEI model on the same data</w:t>
       </w:r>
       <w:r>
         <w:t xml:space="preserve"> </w:t>
@@ -19843,31 +19851,31 @@
         <w:t xml:space="preserve"> </w:t>
       </w:r>
       <w:r>
-        <w:t xml:space="preserve">despite this work’s simpler one-compartment,</w:t>
-      </w:r>
-      <w:r>
-        <w:t xml:space="preserve"> </w:t>
-      </w:r>
-      <w:r>
-        <w:t xml:space="preserve">single-step absorption structure versus the published model’s two-step</w:t>
-      </w:r>
-      <w:r>
-        <w:t xml:space="preserve"> </w:t>
-      </w:r>
-      <w:r>
-        <w:t xml:space="preserve">transit-compartment absorption – a real, external agreement on the</w:t>
-      </w:r>
-      <w:r>
-        <w:t xml:space="preserve"> </w:t>
-      </w:r>
-      <w:r>
-        <w:t xml:space="preserve">parameters that should agree given the shared elimination structure,</w:t>
-      </w:r>
-      <w:r>
-        <w:t xml:space="preserve"> </w:t>
-      </w:r>
-      <w:r>
-        <w:t xml:space="preserve">not merely a directional match.</w:t>
+        <w:t xml:space="preserve">despite this work’s</w:t>
+      </w:r>
+      <w:r>
+        <w:t xml:space="preserve"> </w:t>
+      </w:r>
+      <w:r>
+        <w:t xml:space="preserve">simpler one-compartment, single-step absorption structure versus the</w:t>
+      </w:r>
+      <w:r>
+        <w:t xml:space="preserve"> </w:t>
+      </w:r>
+      <w:r>
+        <w:t xml:space="preserve">published model’s two-step transit-compartment absorption, a real,</w:t>
+      </w:r>
+      <w:r>
+        <w:t xml:space="preserve"> </w:t>
+      </w:r>
+      <w:r>
+        <w:t xml:space="preserve">external agreement on the parameters that should agree given the shared</w:t>
+      </w:r>
+      <w:r>
+        <w:t xml:space="preserve"> </w:t>
+      </w:r>
+      <w:r>
+        <w:t xml:space="preserve">elimination structure, not merely a directional match.</w:t>
       </w:r>
     </w:p>
     <w:tbl>
@@ -21452,49 +21460,43 @@
         </w:r>
       </w:hyperlink>
       <w:r>
-        <w:t xml:space="preserve">), supporting its use as</w:t>
-      </w:r>
-      <w:r>
-        <w:t xml:space="preserve"> </w:t>
-      </w:r>
-      <w:r>
-        <w:t xml:space="preserve">a practical diagnostic on real data where no ground truth is available</w:t>
-      </w:r>
-      <w:r>
-        <w:t xml:space="preserve"> </w:t>
-      </w:r>
-      <w:r>
-        <w:t xml:space="preserve">to check convergence directly. A</w:t>
-      </w:r>
-      <w:r>
-        <w:t xml:space="preserve"> </w:t>
-      </w:r>
-      <w:r>
-        <w:t xml:space="preserve">fixed per-subject tail-count threshold does not separate the two groups</w:t>
-      </w:r>
-      <w:r>
-        <w:t xml:space="preserve"> </w:t>
-      </w:r>
-      <w:r>
-        <w:t xml:space="preserve">as cleanly, reflecting genuine subject-to-subject variation in fit</w:t>
-      </w:r>
-      <w:r>
-        <w:t xml:space="preserve"> </w:t>
-      </w:r>
-      <w:r>
-        <w:t xml:space="preserve">difficulty independent of overall training adequacy; we therefore</w:t>
-      </w:r>
-      <w:r>
-        <w:t xml:space="preserve"> </w:t>
-      </w:r>
-      <w:r>
-        <w:t xml:space="preserve">recommend the aggregate (mean or median) ESS as the primary diagnostic,</w:t>
-      </w:r>
-      <w:r>
-        <w:t xml:space="preserve"> </w:t>
-      </w:r>
-      <w:r>
-        <w:t xml:space="preserve">not a fixed per-subject threshold.</w:t>
+        <w:t xml:space="preserve">), supporting its use as a</w:t>
+      </w:r>
+      <w:r>
+        <w:t xml:space="preserve"> </w:t>
+      </w:r>
+      <w:r>
+        <w:t xml:space="preserve">practical diagnostic on real data where no ground truth is available to</w:t>
+      </w:r>
+      <w:r>
+        <w:t xml:space="preserve"> </w:t>
+      </w:r>
+      <w:r>
+        <w:t xml:space="preserve">check convergence directly. A fixed per-subject tail-count threshold does</w:t>
+      </w:r>
+      <w:r>
+        <w:t xml:space="preserve"> </w:t>
+      </w:r>
+      <w:r>
+        <w:t xml:space="preserve">not separate the two groups as cleanly, reflecting genuine</w:t>
+      </w:r>
+      <w:r>
+        <w:t xml:space="preserve"> </w:t>
+      </w:r>
+      <w:r>
+        <w:t xml:space="preserve">subject-to-subject variation in fit difficulty independent of overall</w:t>
+      </w:r>
+      <w:r>
+        <w:t xml:space="preserve"> </w:t>
+      </w:r>
+      <w:r>
+        <w:t xml:space="preserve">training adequacy; we therefore recommend the aggregate (mean or median)</w:t>
+      </w:r>
+      <w:r>
+        <w:t xml:space="preserve"> </w:t>
+      </w:r>
+      <w:r>
+        <w:t xml:space="preserve">ESS as the primary diagnostic, not a fixed per-subject threshold.</w:t>
       </w:r>
     </w:p>
     <w:tbl>
@@ -21948,7 +21950,7 @@
         <w:t xml:space="preserve"> </w:t>
       </w:r>
       <w:r>
-        <w:t xml:space="preserve">increase – the signature of a systematic, not a finite-sample-noise,</w:t>
+        <w:t xml:space="preserve">increase, the signature of a systematic, not a finite-sample-noise,</w:t>
       </w:r>
       <w:r>
         <w:t xml:space="preserve"> </w:t>
@@ -23101,7 +23103,7 @@
         <w:t xml:space="preserve"> </w:t>
       </w:r>
       <w:r>
-        <w:t xml:space="preserve">respectively – an order of magnitude larger than</w:t>
+        <w:t xml:space="preserve">respectively, an order of magnitude larger than</w:t>
       </w:r>
       <w:r>
         <w:t xml:space="preserve"> </w:t>
@@ -24080,67 +24082,25 @@
         <w:pStyle w:val="BodyText"/>
       </w:pPr>
       <w:r>
-        <w:t xml:space="preserve">[PLACEHOLDER: nlmixr2/NONMEM – a runtime comparison is not yet included.</w:t>
-      </w:r>
-      <w:r>
-        <w:t xml:space="preserve"> </w:t>
-      </w:r>
-      <w:r>
-        <w:t xml:space="preserve">Process CPU time was not correctly captured for the FOCEI/SAEM fits in</w:t>
-      </w:r>
-      <w:r>
-        <w:t xml:space="preserve"> </w:t>
-      </w:r>
-      <w:r>
-        <w:t xml:space="preserve">the results reported above (only variational inference’s</w:t>
-      </w:r>
-      <w:r>
-        <w:t xml:space="preserve"> </w:t>
-      </w:r>
-      <w:r>
-        <w:rPr>
-          <w:rStyle w:val="VerbatimChar"/>
-        </w:rPr>
-        <w:t xml:space="preserve">cpu_secs</w:t>
-      </w:r>
-      <w:r>
-        <w:t xml:space="preserve"> </w:t>
-      </w:r>
-      <w:r>
-        <w:t xml:space="preserve">is</w:t>
-      </w:r>
-      <w:r>
-        <w:t xml:space="preserve"> </w:t>
-      </w:r>
-      <w:r>
-        <w:t xml:space="preserve">currently populated in the underlying data); see Limitations. Once</w:t>
-      </w:r>
-      <w:r>
-        <w:t xml:space="preserve"> </w:t>
-      </w:r>
-      <w:r>
-        <w:t xml:space="preserve">corrected, this section should report the</w:t>
-      </w:r>
-      <w:r>
-        <w:t xml:space="preserve"> </w:t>
-      </w:r>
-      <w:r>
-        <w:rPr>
-          <w:rStyle w:val="VerbatimChar"/>
-        </w:rPr>
-        <w:t xml:space="preserve">cpu_secs</w:t>
-      </w:r>
-      <w:r>
-        <w:t xml:space="preserve"> </w:t>
-      </w:r>
-      <w:r>
-        <w:t xml:space="preserve">comparison directly,</w:t>
-      </w:r>
-      <w:r>
-        <w:t xml:space="preserve"> </w:t>
-      </w:r>
-      <w:r>
-        <w:t xml:space="preserve">alongside the accuracy comparison above.]</w:t>
+        <w:t xml:space="preserve">A runtime comparison is not included: process CPU time was not correctly</w:t>
+      </w:r>
+      <w:r>
+        <w:t xml:space="preserve"> </w:t>
+      </w:r>
+      <w:r>
+        <w:t xml:space="preserve">captured for the FOCEI and SAEM fits reported above (only variational</w:t>
+      </w:r>
+      <w:r>
+        <w:t xml:space="preserve"> </w:t>
+      </w:r>
+      <w:r>
+        <w:t xml:space="preserve">inference’s runtime is currently populated in the underlying data); see</w:t>
+      </w:r>
+      <w:r>
+        <w:t xml:space="preserve"> </w:t>
+      </w:r>
+      <w:r>
+        <w:t xml:space="preserve">Limitations.</w:t>
       </w:r>
     </w:p>
     <w:bookmarkEnd w:id="81"/>
@@ -24188,25 +24148,25 @@
         </m:r>
       </m:oMath>
       <w:r>
-        <w:t xml:space="preserve">)</w:t>
-      </w:r>
-      <w:r>
-        <w:t xml:space="preserve"> </w:t>
-      </w:r>
-      <w:r>
-        <w:t xml:space="preserve">variational inference systematically underestimates between-subject</w:t>
-      </w:r>
-      <w:r>
-        <w:t xml:space="preserve"> </w:t>
-      </w:r>
-      <w:r>
-        <w:t xml:space="preserve">variance components, this bias is substantially correctable by</w:t>
-      </w:r>
-      <w:r>
-        <w:t xml:space="preserve"> </w:t>
-      </w:r>
-      <w:r>
-        <w:t xml:space="preserve">importance-weighting the training objective (</w:t>
+        <w:t xml:space="preserve">) variational</w:t>
+      </w:r>
+      <w:r>
+        <w:t xml:space="preserve"> </w:t>
+      </w:r>
+      <w:r>
+        <w:t xml:space="preserve">inference systematically underestimates between-subject variance</w:t>
+      </w:r>
+      <w:r>
+        <w:t xml:space="preserve"> </w:t>
+      </w:r>
+      <w:r>
+        <w:t xml:space="preserve">components, this bias is substantially correctable by importance-</w:t>
+      </w:r>
+      <w:r>
+        <w:t xml:space="preserve"> </w:t>
+      </w:r>
+      <w:r>
+        <w:t xml:space="preserve">weighting the training objective (</w:t>
       </w:r>
       <m:oMath>
         <m:r>
@@ -24223,37 +24183,37 @@
         </m:r>
       </m:oMath>
       <w:r>
-        <w:t xml:space="preserve">) or by using a richer</w:t>
-      </w:r>
-      <w:r>
-        <w:t xml:space="preserve"> </w:t>
-      </w:r>
-      <w:r>
-        <w:t xml:space="preserve">variational family (normalizing flows), and the correction reproduces on</w:t>
-      </w:r>
-      <w:r>
-        <w:t xml:space="preserve"> </w:t>
-      </w:r>
-      <w:r>
-        <w:t xml:space="preserve">real pharmacokinetic data with external validation against an</w:t>
-      </w:r>
-      <w:r>
-        <w:t xml:space="preserve"> </w:t>
-      </w:r>
-      <w:r>
-        <w:t xml:space="preserve">independently published fit. Directly against independent FOCEI and SAEM</w:t>
-      </w:r>
-      <w:r>
-        <w:t xml:space="preserve"> </w:t>
-      </w:r>
-      <w:r>
-        <w:t xml:space="preserve">baseline fits on matched simulated data, corrected variational inference</w:t>
-      </w:r>
-      <w:r>
-        <w:t xml:space="preserve"> </w:t>
-      </w:r>
-      <w:r>
-        <w:t xml:space="preserve">matches both established methods’ accuracy closely, while uncorrected</w:t>
+        <w:t xml:space="preserve">) or by using a richer variational</w:t>
+      </w:r>
+      <w:r>
+        <w:t xml:space="preserve"> </w:t>
+      </w:r>
+      <w:r>
+        <w:t xml:space="preserve">family (normalizing flows), and the correction reproduces on real</w:t>
+      </w:r>
+      <w:r>
+        <w:t xml:space="preserve"> </w:t>
+      </w:r>
+      <w:r>
+        <w:t xml:space="preserve">pharmacokinetic data with external validation against an independently</w:t>
+      </w:r>
+      <w:r>
+        <w:t xml:space="preserve"> </w:t>
+      </w:r>
+      <w:r>
+        <w:t xml:space="preserve">published fit. Directly against independent FOCEI and SAEM baseline fits</w:t>
+      </w:r>
+      <w:r>
+        <w:t xml:space="preserve"> </w:t>
+      </w:r>
+      <w:r>
+        <w:t xml:space="preserve">on matched simulated data, corrected variational inference matches both</w:t>
+      </w:r>
+      <w:r>
+        <w:t xml:space="preserve"> </w:t>
+      </w:r>
+      <w:r>
+        <w:t xml:space="preserve">established methods’ accuracy closely, while uncorrected</w:t>
       </w:r>
       <w:r>
         <w:t xml:space="preserve"> </w:t>
@@ -24276,61 +24236,67 @@
         <w:t xml:space="preserve"> </w:t>
       </w:r>
       <w:r>
-        <w:t xml:space="preserve">shows bias an order of magnitude larger on the most affected</w:t>
-      </w:r>
-      <w:r>
-        <w:t xml:space="preserve"> </w:t>
-      </w:r>
-      <w:r>
-        <w:t xml:space="preserve">parameters – evidence that the correction identified in this work is not</w:t>
-      </w:r>
-      <w:r>
-        <w:t xml:space="preserve"> </w:t>
-      </w:r>
-      <w:r>
-        <w:t xml:space="preserve">merely an internal, self-referential improvement within variational</w:t>
-      </w:r>
-      <w:r>
-        <w:t xml:space="preserve"> </w:t>
-      </w:r>
-      <w:r>
-        <w:t xml:space="preserve">inference, but brings VI to a level of accuracy quantitatively</w:t>
-      </w:r>
-      <w:r>
-        <w:t xml:space="preserve"> </w:t>
-      </w:r>
-      <w:r>
-        <w:t xml:space="preserve">comparable to the methods it is proposed to replace. This supports the</w:t>
-      </w:r>
-      <w:r>
-        <w:t xml:space="preserve"> </w:t>
-      </w:r>
-      <w:r>
-        <w:t xml:space="preserve">practical use of corrected variational inference as a faster alternative</w:t>
-      </w:r>
-      <w:r>
-        <w:t xml:space="preserve"> </w:t>
-      </w:r>
-      <w:r>
-        <w:t xml:space="preserve">to FOCEI/SAEM for NLME model fitting, with two important caveats</w:t>
-      </w:r>
-      <w:r>
-        <w:t xml:space="preserve"> </w:t>
-      </w:r>
-      <w:r>
-        <w:t xml:space="preserve">developed below: not every posterior architecture is safe to use for</w:t>
-      </w:r>
-      <w:r>
-        <w:t xml:space="preserve"> </w:t>
-      </w:r>
-      <w:r>
-        <w:t xml:space="preserve">every purpose, and the correction of point estimates does not</w:t>
-      </w:r>
-      <w:r>
-        <w:t xml:space="preserve"> </w:t>
-      </w:r>
-      <w:r>
-        <w:t xml:space="preserve">automatically extend to every downstream use of a fitted model.</w:t>
+        <w:t xml:space="preserve">shows</w:t>
+      </w:r>
+      <w:r>
+        <w:t xml:space="preserve"> </w:t>
+      </w:r>
+      <w:r>
+        <w:t xml:space="preserve">bias an order of magnitude larger on the most affected parameters,</w:t>
+      </w:r>
+      <w:r>
+        <w:t xml:space="preserve"> </w:t>
+      </w:r>
+      <w:r>
+        <w:t xml:space="preserve">evidence that the correction identified in this work is not merely an</w:t>
+      </w:r>
+      <w:r>
+        <w:t xml:space="preserve"> </w:t>
+      </w:r>
+      <w:r>
+        <w:t xml:space="preserve">internal, self-referential improvement within variational inference, but</w:t>
+      </w:r>
+      <w:r>
+        <w:t xml:space="preserve"> </w:t>
+      </w:r>
+      <w:r>
+        <w:t xml:space="preserve">brings VI to a level of accuracy quantitatively comparable to the methods</w:t>
+      </w:r>
+      <w:r>
+        <w:t xml:space="preserve"> </w:t>
+      </w:r>
+      <w:r>
+        <w:t xml:space="preserve">it is proposed to replace. This supports the practical use of corrected</w:t>
+      </w:r>
+      <w:r>
+        <w:t xml:space="preserve"> </w:t>
+      </w:r>
+      <w:r>
+        <w:t xml:space="preserve">variational inference as a faster alternative to FOCEI/SAEM for NLME</w:t>
+      </w:r>
+      <w:r>
+        <w:t xml:space="preserve"> </w:t>
+      </w:r>
+      <w:r>
+        <w:t xml:space="preserve">model fitting, with two important caveats developed below: not every</w:t>
+      </w:r>
+      <w:r>
+        <w:t xml:space="preserve"> </w:t>
+      </w:r>
+      <w:r>
+        <w:t xml:space="preserve">posterior architecture is safe to use for every purpose, and the</w:t>
+      </w:r>
+      <w:r>
+        <w:t xml:space="preserve"> </w:t>
+      </w:r>
+      <w:r>
+        <w:t xml:space="preserve">correction of point estimates does not automatically extend to every</w:t>
+      </w:r>
+      <w:r>
+        <w:t xml:space="preserve"> </w:t>
+      </w:r>
+      <w:r>
+        <w:t xml:space="preserve">downstream use of a fitted model.</w:t>
       </w:r>
     </w:p>
     <w:p>
@@ -24436,31 +24402,31 @@
         <w:t xml:space="preserve"> </w:t>
       </w:r>
       <w:r>
-        <w:t xml:space="preserve">recommended for nonlinear structural models pending further</w:t>
-      </w:r>
-      <w:r>
-        <w:t xml:space="preserve"> </w:t>
-      </w:r>
-      <w:r>
-        <w:t xml:space="preserve">investigation of this failure mode. Third, likelihood-ratio tests</w:t>
-      </w:r>
-      <w:r>
-        <w:t xml:space="preserve"> </w:t>
-      </w:r>
-      <w:r>
-        <w:t xml:space="preserve">comparing models that differ in random-effect structure should use an</w:t>
-      </w:r>
-      <w:r>
-        <w:t xml:space="preserve"> </w:t>
-      </w:r>
-      <w:r>
-        <w:t xml:space="preserve">amortized rather than free posterior, given the effective-degrees-of-</w:t>
-      </w:r>
-      <w:r>
-        <w:t xml:space="preserve"> </w:t>
-      </w:r>
-      <w:r>
-        <w:t xml:space="preserve">freedom mismatch identified above; free-posterior fixed-effect and</w:t>
+        <w:t xml:space="preserve">recommended for nonlinear structural models pending further investigation</w:t>
+      </w:r>
+      <w:r>
+        <w:t xml:space="preserve"> </w:t>
+      </w:r>
+      <w:r>
+        <w:t xml:space="preserve">of this failure mode. Third, likelihood-ratio tests comparing models that</w:t>
+      </w:r>
+      <w:r>
+        <w:t xml:space="preserve"> </w:t>
+      </w:r>
+      <w:r>
+        <w:t xml:space="preserve">differ in random-effect structure should use an amortized rather than</w:t>
+      </w:r>
+      <w:r>
+        <w:t xml:space="preserve"> </w:t>
+      </w:r>
+      <w:r>
+        <w:t xml:space="preserve">free posterior, given the effective-degrees-of-freedom mismatch</w:t>
+      </w:r>
+      <w:r>
+        <w:t xml:space="preserve"> </w:t>
+      </w:r>
+      <w:r>
+        <w:t xml:space="preserve">identified above; free-posterior fixed-effect and</w:t>
       </w:r>
       <w:r>
         <w:t xml:space="preserve"> </w:t>
@@ -24474,13 +24440,19 @@
         <w:t xml:space="preserve"> </w:t>
       </w:r>
       <w:r>
-        <w:t xml:space="preserve">point estimates themselves remain valid, only their use for</w:t>
-      </w:r>
-      <w:r>
-        <w:t xml:space="preserve"> </w:t>
-      </w:r>
-      <w:r>
-        <w:t xml:space="preserve">nested-model hypothesis testing is affected.</w:t>
+        <w:t xml:space="preserve">point</w:t>
+      </w:r>
+      <w:r>
+        <w:t xml:space="preserve"> </w:t>
+      </w:r>
+      <w:r>
+        <w:t xml:space="preserve">estimates themselves remain valid, only their use for nested-model</w:t>
+      </w:r>
+      <w:r>
+        <w:t xml:space="preserve"> </w:t>
+      </w:r>
+      <w:r>
+        <w:t xml:space="preserve">hypothesis testing is affected.</w:t>
       </w:r>
     </w:p>
     <w:p>
@@ -24650,7 +24622,7 @@
         <w:t xml:space="preserve"> </w:t>
       </w:r>
       <w:r>
-        <w:t xml:space="preserve">established understanding –</w:t>
+        <w:t xml:space="preserve">established understanding,</w:t>
       </w:r>
       <w:r>
         <w:t xml:space="preserve"> </w:t>
@@ -24697,19 +24669,19 @@
         <w:t xml:space="preserve"> </w:t>
       </w:r>
       <w:r>
-        <w:t xml:space="preserve">small-sample bias discussed below – is itself supporting evidence for</w:t>
-      </w:r>
-      <w:r>
-        <w:t xml:space="preserve"> </w:t>
-      </w:r>
-      <w:r>
-        <w:t xml:space="preserve">this interpretation, though a direct comparison against FOCEI/SAEM on the</w:t>
-      </w:r>
-      <w:r>
-        <w:t xml:space="preserve"> </w:t>
-      </w:r>
-      <w:r>
-        <w:t xml:space="preserve">same restricted model specification would strengthen it further; the</w:t>
+        <w:t xml:space="preserve">small-sample bias discussed below, is itself supporting evidence for this</w:t>
+      </w:r>
+      <w:r>
+        <w:t xml:space="preserve"> </w:t>
+      </w:r>
+      <w:r>
+        <w:t xml:space="preserve">interpretation, though a direct comparison against FOCEI/SAEM on the same</w:t>
+      </w:r>
+      <w:r>
+        <w:t xml:space="preserve"> </w:t>
+      </w:r>
+      <w:r>
+        <w:t xml:space="preserve">restricted model specification would strengthen it further; the</w:t>
       </w:r>
       <w:r>
         <w:t xml:space="preserve"> </w:t>
@@ -24799,13 +24771,13 @@
         <w:t xml:space="preserve"> </w:t>
       </w:r>
       <w:r>
-        <w:t xml:space="preserve">bias in variance-component estimation – the same phenomenon that</w:t>
-      </w:r>
-      <w:r>
-        <w:t xml:space="preserve"> </w:t>
-      </w:r>
-      <w:r>
-        <w:t xml:space="preserve">motivates REML-type corrections in linear mixed models – rather than a</w:t>
+        <w:t xml:space="preserve">bias in variance-component estimation, the same phenomenon that</w:t>
+      </w:r>
+      <w:r>
+        <w:t xml:space="preserve"> </w:t>
+      </w:r>
+      <w:r>
+        <w:t xml:space="preserve">motivates REML-type corrections in linear mixed models, rather than a</w:t>
       </w:r>
       <w:r>
         <w:t xml:space="preserve"> </w:t>
@@ -24898,31 +24870,25 @@
         <w:t xml:space="preserve"> </w:t>
       </w:r>
       <w:r>
-        <w:t xml:space="preserve">[PLACEHOLDER: expand this paragraph once/if the</w:t>
-      </w:r>
-      <w:r>
-        <w:t xml:space="preserve"> </w:t>
-      </w:r>
-      <w:r>
-        <w:t xml:space="preserve">architectural variant described below is validated.] The amortized+flow</w:t>
-      </w:r>
-      <w:r>
-        <w:t xml:space="preserve"> </w:t>
-      </w:r>
-      <w:r>
-        <w:t xml:space="preserve">instability is plausibly explained by the amortized encoder’s output</w:t>
-      </w:r>
-      <w:r>
-        <w:t xml:space="preserve"> </w:t>
-      </w:r>
-      <w:r>
-        <w:t xml:space="preserve">serving a double role – both defining the flow’s base distribution and</w:t>
-      </w:r>
-      <w:r>
-        <w:t xml:space="preserve"> </w:t>
-      </w:r>
-      <w:r>
-        <w:t xml:space="preserve">its conditioning input – under this specific configuration. Notably,</w:t>
+        <w:t xml:space="preserve">The amortized+flow instability is plausibly explained by the</w:t>
+      </w:r>
+      <w:r>
+        <w:t xml:space="preserve"> </w:t>
+      </w:r>
+      <w:r>
+        <w:t xml:space="preserve">amortized encoder’s output serving a double role, both defining the</w:t>
+      </w:r>
+      <w:r>
+        <w:t xml:space="preserve"> </w:t>
+      </w:r>
+      <w:r>
+        <w:t xml:space="preserve">flow’s base distribution and its conditioning input, under this specific</w:t>
+      </w:r>
+      <w:r>
+        <w:t xml:space="preserve"> </w:t>
+      </w:r>
+      <w:r>
+        <w:t xml:space="preserve">configuration. Notably,</w:t>
       </w:r>
       <w:r>
         <w:t xml:space="preserve"> </w:t>
@@ -24931,109 +24897,109 @@
         <w:t xml:space="preserve">Arruda et al. (2024)</w:t>
       </w:r>
       <w:r>
-        <w:t xml:space="preserve">’s independent amortized-flow architecture for NLME</w:t>
-      </w:r>
-      <w:r>
-        <w:t xml:space="preserve"> </w:t>
-      </w:r>
-      <w:r>
-        <w:t xml:space="preserve">models does not share this coupling: their conditional normalizing</w:t>
-      </w:r>
-      <w:r>
-        <w:t xml:space="preserve"> </w:t>
-      </w:r>
-      <w:r>
-        <w:t xml:space="preserve">flow’s base distribution is a fixed standard normal, with the amortized</w:t>
-      </w:r>
-      <w:r>
-        <w:t xml:space="preserve"> </w:t>
-      </w:r>
-      <w:r>
-        <w:t xml:space="preserve">encoder’s (LSTM-based) summary statistics used solely as the flow’s</w:t>
-      </w:r>
-      <w:r>
-        <w:t xml:space="preserve"> </w:t>
-      </w:r>
-      <w:r>
-        <w:t xml:space="preserve">conditioning input, never as the base distribution’s own parameters. A</w:t>
-      </w:r>
-      <w:r>
-        <w:t xml:space="preserve"> </w:t>
-      </w:r>
-      <w:r>
-        <w:t xml:space="preserve">preliminary, architecturally decoupled variant following this design was</w:t>
-      </w:r>
-      <w:r>
-        <w:t xml:space="preserve"> </w:t>
-      </w:r>
-      <w:r>
-        <w:t xml:space="preserve">implemented and smoke-tested in the course of this work, producing</w:t>
-      </w:r>
-      <w:r>
-        <w:t xml:space="preserve"> </w:t>
-      </w:r>
-      <w:r>
-        <w:t xml:space="preserve">plausible (non-divergent) parameter estimates on a small-scale test, but</w:t>
-      </w:r>
-      <w:r>
-        <w:t xml:space="preserve"> </w:t>
-      </w:r>
-      <w:r>
-        <w:t xml:space="preserve">has not been validated at the scale needed to report as a result; we</w:t>
-      </w:r>
-      <w:r>
-        <w:t xml:space="preserve"> </w:t>
-      </w:r>
-      <w:r>
-        <w:t xml:space="preserve">flag it as a concrete, motivated direction for resolving this</w:t>
-      </w:r>
-      <w:r>
-        <w:t xml:space="preserve"> </w:t>
-      </w:r>
-      <w:r>
-        <w:t xml:space="preserve">instability rather than treating it as an unexplained dead end. The</w:t>
-      </w:r>
-      <w:r>
-        <w:t xml:space="preserve"> </w:t>
-      </w:r>
-      <w:r>
-        <w:t xml:space="preserve">amortized-nonlinear-model instability observed independently on the</w:t>
-      </w:r>
-      <w:r>
-        <w:t xml:space="preserve"> </w:t>
-      </w:r>
-      <w:r>
-        <w:t xml:space="preserve">Michaelis-Menten tier does not involve a flow at all and is therefore a</w:t>
-      </w:r>
-      <w:r>
-        <w:t xml:space="preserve"> </w:t>
-      </w:r>
-      <w:r>
-        <w:t xml:space="preserve">distinct problem; we speculate that it may reflect the greater difficulty</w:t>
-      </w:r>
-      <w:r>
-        <w:t xml:space="preserve"> </w:t>
-      </w:r>
-      <w:r>
-        <w:t xml:space="preserve">of learning one shared encoder mapping across subjects whose trajectory</w:t>
-      </w:r>
-      <w:r>
-        <w:t xml:space="preserve"> </w:t>
-      </w:r>
-      <w:r>
-        <w:t xml:space="preserve">shapes vary substantially more (spanning saturated, transitional, and</w:t>
-      </w:r>
-      <w:r>
-        <w:t xml:space="preserve"> </w:t>
-      </w:r>
-      <w:r>
-        <w:t xml:space="preserve">first-order elimination regimes) than the comparatively uniform</w:t>
-      </w:r>
-      <w:r>
-        <w:t xml:space="preserve"> </w:t>
-      </w:r>
-      <w:r>
-        <w:t xml:space="preserve">trajectory shapes of the linear tier, but this is not yet tested.</w:t>
+        <w:t xml:space="preserve">’s independent amortized-flow</w:t>
+      </w:r>
+      <w:r>
+        <w:t xml:space="preserve"> </w:t>
+      </w:r>
+      <w:r>
+        <w:t xml:space="preserve">architecture for NLME models does not share this coupling: their</w:t>
+      </w:r>
+      <w:r>
+        <w:t xml:space="preserve"> </w:t>
+      </w:r>
+      <w:r>
+        <w:t xml:space="preserve">conditional normalizing flow’s base distribution is a fixed standard</w:t>
+      </w:r>
+      <w:r>
+        <w:t xml:space="preserve"> </w:t>
+      </w:r>
+      <w:r>
+        <w:t xml:space="preserve">normal, with the amortized encoder’s (LSTM-based) summary statistics used</w:t>
+      </w:r>
+      <w:r>
+        <w:t xml:space="preserve"> </w:t>
+      </w:r>
+      <w:r>
+        <w:t xml:space="preserve">solely as the flow’s conditioning input, never as the base distribution’s</w:t>
+      </w:r>
+      <w:r>
+        <w:t xml:space="preserve"> </w:t>
+      </w:r>
+      <w:r>
+        <w:t xml:space="preserve">own parameters. A preliminary, architecturally decoupled variant</w:t>
+      </w:r>
+      <w:r>
+        <w:t xml:space="preserve"> </w:t>
+      </w:r>
+      <w:r>
+        <w:t xml:space="preserve">following this design was implemented and smoke-tested in the course of</w:t>
+      </w:r>
+      <w:r>
+        <w:t xml:space="preserve"> </w:t>
+      </w:r>
+      <w:r>
+        <w:t xml:space="preserve">this work, producing plausible (non-divergent) parameter estimates on a</w:t>
+      </w:r>
+      <w:r>
+        <w:t xml:space="preserve"> </w:t>
+      </w:r>
+      <w:r>
+        <w:t xml:space="preserve">small-scale test, but has not been validated at the scale needed to</w:t>
+      </w:r>
+      <w:r>
+        <w:t xml:space="preserve"> </w:t>
+      </w:r>
+      <w:r>
+        <w:t xml:space="preserve">report as a result; we flag it as a concrete, motivated direction for</w:t>
+      </w:r>
+      <w:r>
+        <w:t xml:space="preserve"> </w:t>
+      </w:r>
+      <w:r>
+        <w:t xml:space="preserve">resolving this instability rather than treating it as an unexplained dead</w:t>
+      </w:r>
+      <w:r>
+        <w:t xml:space="preserve"> </w:t>
+      </w:r>
+      <w:r>
+        <w:t xml:space="preserve">end. The amortized-nonlinear-model instability observed independently on</w:t>
+      </w:r>
+      <w:r>
+        <w:t xml:space="preserve"> </w:t>
+      </w:r>
+      <w:r>
+        <w:t xml:space="preserve">the Michaelis-Menten tier does not involve a flow at all and is therefore</w:t>
+      </w:r>
+      <w:r>
+        <w:t xml:space="preserve"> </w:t>
+      </w:r>
+      <w:r>
+        <w:t xml:space="preserve">a distinct problem; we speculate that it may reflect the greater</w:t>
+      </w:r>
+      <w:r>
+        <w:t xml:space="preserve"> </w:t>
+      </w:r>
+      <w:r>
+        <w:t xml:space="preserve">difficulty of learning one shared encoder mapping across subjects whose</w:t>
+      </w:r>
+      <w:r>
+        <w:t xml:space="preserve"> </w:t>
+      </w:r>
+      <w:r>
+        <w:t xml:space="preserve">trajectory shapes vary substantially more (spanning saturated,</w:t>
+      </w:r>
+      <w:r>
+        <w:t xml:space="preserve"> </w:t>
+      </w:r>
+      <w:r>
+        <w:t xml:space="preserve">transitional, and first-order elimination regimes) than the comparatively</w:t>
+      </w:r>
+      <w:r>
+        <w:t xml:space="preserve"> </w:t>
+      </w:r>
+      <w:r>
+        <w:t xml:space="preserve">uniform trajectory shapes of the linear tier, but this is not yet tested.</w:t>
       </w:r>
     </w:p>
     <w:p>
@@ -25057,55 +25023,49 @@
         <w:t xml:space="preserve"> </w:t>
       </w:r>
       <w:r>
-        <w:t xml:space="preserve">Results) is now complete and directly supports this work’s central</w:t>
-      </w:r>
-      <w:r>
-        <w:t xml:space="preserve"> </w:t>
-      </w:r>
-      <w:r>
-        <w:t xml:space="preserve">claim on the linear tier. Two gaps remain. [PLACEHOLDER: nlmixr2/NONMEM</w:t>
-      </w:r>
-      <w:r>
-        <w:t xml:space="preserve"> </w:t>
-      </w:r>
-      <w:r>
-        <w:t xml:space="preserve">– first, the runtime side of that comparison is not yet reported:</w:t>
-      </w:r>
-      <w:r>
-        <w:t xml:space="preserve"> </w:t>
-      </w:r>
-      <w:r>
-        <w:t xml:space="preserve">process CPU time was not correctly captured for the FOCEI/SAEM fits in</w:t>
-      </w:r>
-      <w:r>
-        <w:t xml:space="preserve"> </w:t>
-      </w:r>
-      <w:r>
-        <w:t xml:space="preserve">the current baseline pipeline, so the practical</w:t>
-      </w:r>
-      <w:r>
-        <w:t xml:space="preserve"> </w:t>
-      </w:r>
-      <w:r>
-        <w:t xml:space="preserve">“how much faster”</w:t>
-      </w:r>
-      <w:r>
-        <w:t xml:space="preserve"> </w:t>
-      </w:r>
-      <w:r>
-        <w:t xml:space="preserve">question this work is partly motivated by cannot yet be answered</w:t>
-      </w:r>
-      <w:r>
-        <w:t xml:space="preserve"> </w:t>
-      </w:r>
-      <w:r>
-        <w:t xml:space="preserve">quantitatively for this model, only by comparison to the general</w:t>
-      </w:r>
-      <w:r>
-        <w:t xml:space="preserve"> </w:t>
-      </w:r>
-      <w:r>
-        <w:t xml:space="preserve">literature’s reported comparisons for other models (e.g.</w:t>
+        <w:t xml:space="preserve">Results) is now complete and directly supports this work’s central claim</w:t>
+      </w:r>
+      <w:r>
+        <w:t xml:space="preserve"> </w:t>
+      </w:r>
+      <w:r>
+        <w:t xml:space="preserve">on the linear tier. Two gaps remain. First, the runtime side of that</w:t>
+      </w:r>
+      <w:r>
+        <w:t xml:space="preserve"> </w:t>
+      </w:r>
+      <w:r>
+        <w:t xml:space="preserve">comparison is not yet reported: process CPU time was not correctly</w:t>
+      </w:r>
+      <w:r>
+        <w:t xml:space="preserve"> </w:t>
+      </w:r>
+      <w:r>
+        <w:t xml:space="preserve">captured for the FOCEI and SAEM fits in the current baseline pipeline, so</w:t>
+      </w:r>
+      <w:r>
+        <w:t xml:space="preserve"> </w:t>
+      </w:r>
+      <w:r>
+        <w:t xml:space="preserve">the practical question of how much faster variational inference is</w:t>
+      </w:r>
+      <w:r>
+        <w:t xml:space="preserve"> </w:t>
+      </w:r>
+      <w:r>
+        <w:t xml:space="preserve">cannot yet be answered quantitatively for this model, only by comparison</w:t>
+      </w:r>
+      <w:r>
+        <w:t xml:space="preserve"> </w:t>
+      </w:r>
+      <w:r>
+        <w:t xml:space="preserve">to the general literature’s reported comparisons for other models (for</w:t>
+      </w:r>
+      <w:r>
+        <w:t xml:space="preserve"> </w:t>
+      </w:r>
+      <w:r>
+        <w:t xml:space="preserve">example,</w:t>
       </w:r>
       <w:r>
         <w:t xml:space="preserve"> </w:t>
@@ -25114,115 +25074,118 @@
         <w:t xml:space="preserve">Arruda et al. (2024)</w:t>
       </w:r>
       <w:r>
-        <w:t xml:space="preserve">’s reported roughly two-orders-of-magnitude speedup</w:t>
-      </w:r>
-      <w:r>
-        <w:t xml:space="preserve"> </w:t>
-      </w:r>
-      <w:r>
-        <w:t xml:space="preserve">on their tested models). This is expected to be resolved by correcting</w:t>
-      </w:r>
-      <w:r>
-        <w:t xml:space="preserve"> </w:t>
-      </w:r>
-      <w:r>
-        <w:t xml:space="preserve">the runtime measurement in the baseline pipeline. Second, the baseline</w:t>
-      </w:r>
-      <w:r>
-        <w:t xml:space="preserve"> </w:t>
-      </w:r>
-      <w:r>
-        <w:t xml:space="preserve">comparison currently covers only the linear tier; extending it to the</w:t>
-      </w:r>
-      <w:r>
-        <w:t xml:space="preserve"> </w:t>
-      </w:r>
-      <w:r>
-        <w:t xml:space="preserve">Michaelis-Menten nonlinear tier would substantiate the identifiability</w:t>
-      </w:r>
-      <w:r>
-        <w:t xml:space="preserve"> </w:t>
-      </w:r>
-      <w:r>
-        <w:t xml:space="preserve">claim made above with a direct comparison rather than an appeal to</w:t>
-      </w:r>
-      <w:r>
-        <w:t xml:space="preserve"> </w:t>
-      </w:r>
-      <w:r>
-        <w:t xml:space="preserve">general pharmacometric practice.] Beyond the baseline comparison, this</w:t>
-      </w:r>
-      <w:r>
-        <w:t xml:space="preserve"> </w:t>
-      </w:r>
-      <w:r>
-        <w:t xml:space="preserve">work tests a single linear structural model class and a single nonlinear</w:t>
-      </w:r>
-      <w:r>
-        <w:t xml:space="preserve"> </w:t>
-      </w:r>
-      <w:r>
-        <w:t xml:space="preserve">structural model class; whether the identified biases and corrections</w:t>
-      </w:r>
-      <w:r>
-        <w:t xml:space="preserve"> </w:t>
-      </w:r>
-      <w:r>
-        <w:t xml:space="preserve">generalize to structurally more complex models (multiple compartments,</w:t>
-      </w:r>
-      <w:r>
-        <w:t xml:space="preserve"> </w:t>
-      </w:r>
-      <w:r>
-        <w:t xml:space="preserve">covariate effects, time-varying dosing) is not directly tested here. The</w:t>
-      </w:r>
-      <w:r>
-        <w:t xml:space="preserve"> </w:t>
-      </w:r>
-      <w:r>
-        <w:t xml:space="preserve">residual, smaller miscalibration remaining in the amortized-posterior</w:t>
-      </w:r>
-      <w:r>
-        <w:t xml:space="preserve"> </w:t>
-      </w:r>
-      <w:r>
-        <w:t xml:space="preserve">likelihood-ratio test calibration after the boundary-mass correction</w:t>
-      </w:r>
-      <w:r>
-        <w:t xml:space="preserve"> </w:t>
-      </w:r>
-      <w:r>
-        <w:t xml:space="preserve">(see Results) also remains unexplained; a follow-up analysis testing</w:t>
-      </w:r>
-      <w:r>
-        <w:t xml:space="preserve"> </w:t>
-      </w:r>
-      <w:r>
-        <w:t xml:space="preserve">whether divergence in the two nested models’ residual-error estimates</w:t>
-      </w:r>
-      <w:r>
-        <w:t xml:space="preserve"> </w:t>
-      </w:r>
-      <w:r>
-        <w:t xml:space="preserve">explains this residual found a real correlation but could not establish</w:t>
-      </w:r>
-      <w:r>
-        <w:t xml:space="preserve"> </w:t>
-      </w:r>
-      <w:r>
-        <w:t xml:space="preserve">it as a mechanism independent of the already-understood boundary-mass</w:t>
-      </w:r>
-      <w:r>
-        <w:t xml:space="preserve"> </w:t>
-      </w:r>
-      <w:r>
-        <w:t xml:space="preserve">effect, given that the residual-error parameter appears directly inside</w:t>
-      </w:r>
-      <w:r>
-        <w:t xml:space="preserve"> </w:t>
-      </w:r>
-      <w:r>
-        <w:t xml:space="preserve">the likelihood by construction.</w:t>
+        <w:t xml:space="preserve"> </w:t>
+      </w:r>
+      <w:r>
+        <w:t xml:space="preserve">report roughly two orders of magnitude</w:t>
+      </w:r>
+      <w:r>
+        <w:t xml:space="preserve"> </w:t>
+      </w:r>
+      <w:r>
+        <w:t xml:space="preserve">speedup on their tested models). This is expected to be resolved by</w:t>
+      </w:r>
+      <w:r>
+        <w:t xml:space="preserve"> </w:t>
+      </w:r>
+      <w:r>
+        <w:t xml:space="preserve">correcting the runtime measurement in the baseline pipeline. Second, the</w:t>
+      </w:r>
+      <w:r>
+        <w:t xml:space="preserve"> </w:t>
+      </w:r>
+      <w:r>
+        <w:t xml:space="preserve">baseline comparison currently covers only the linear tier; extending it</w:t>
+      </w:r>
+      <w:r>
+        <w:t xml:space="preserve"> </w:t>
+      </w:r>
+      <w:r>
+        <w:t xml:space="preserve">to the Michaelis-Menten nonlinear tier would substantiate the</w:t>
+      </w:r>
+      <w:r>
+        <w:t xml:space="preserve"> </w:t>
+      </w:r>
+      <w:r>
+        <w:t xml:space="preserve">identifiability claim made above with a direct comparison rather than an</w:t>
+      </w:r>
+      <w:r>
+        <w:t xml:space="preserve"> </w:t>
+      </w:r>
+      <w:r>
+        <w:t xml:space="preserve">appeal to general pharmacometric practice. Beyond the baseline</w:t>
+      </w:r>
+      <w:r>
+        <w:t xml:space="preserve"> </w:t>
+      </w:r>
+      <w:r>
+        <w:t xml:space="preserve">comparison, this work tests a single linear structural model class and a</w:t>
+      </w:r>
+      <w:r>
+        <w:t xml:space="preserve"> </w:t>
+      </w:r>
+      <w:r>
+        <w:t xml:space="preserve">single nonlinear structural model class; whether the identified biases</w:t>
+      </w:r>
+      <w:r>
+        <w:t xml:space="preserve"> </w:t>
+      </w:r>
+      <w:r>
+        <w:t xml:space="preserve">and corrections generalize to structurally more complex models (multiple</w:t>
+      </w:r>
+      <w:r>
+        <w:t xml:space="preserve"> </w:t>
+      </w:r>
+      <w:r>
+        <w:t xml:space="preserve">compartments, covariate effects, time-varying dosing) is not directly</w:t>
+      </w:r>
+      <w:r>
+        <w:t xml:space="preserve"> </w:t>
+      </w:r>
+      <w:r>
+        <w:t xml:space="preserve">tested here. The residual, smaller miscalibration remaining in the</w:t>
+      </w:r>
+      <w:r>
+        <w:t xml:space="preserve"> </w:t>
+      </w:r>
+      <w:r>
+        <w:t xml:space="preserve">amortized-posterior likelihood-ratio test calibration after the</w:t>
+      </w:r>
+      <w:r>
+        <w:t xml:space="preserve"> </w:t>
+      </w:r>
+      <w:r>
+        <w:t xml:space="preserve">boundary-mass correction (see Results) also remains unexplained; a</w:t>
+      </w:r>
+      <w:r>
+        <w:t xml:space="preserve"> </w:t>
+      </w:r>
+      <w:r>
+        <w:t xml:space="preserve">follow-up analysis testing whether divergence in the two nested models’</w:t>
+      </w:r>
+      <w:r>
+        <w:t xml:space="preserve"> </w:t>
+      </w:r>
+      <w:r>
+        <w:t xml:space="preserve">residual-error estimates explains this residual found a real correlation</w:t>
+      </w:r>
+      <w:r>
+        <w:t xml:space="preserve"> </w:t>
+      </w:r>
+      <w:r>
+        <w:t xml:space="preserve">but could not establish it as a mechanism independent of the</w:t>
+      </w:r>
+      <w:r>
+        <w:t xml:space="preserve"> </w:t>
+      </w:r>
+      <w:r>
+        <w:t xml:space="preserve">already-understood boundary-mass effect, given that the residual-error</w:t>
+      </w:r>
+      <w:r>
+        <w:t xml:space="preserve"> </w:t>
+      </w:r>
+      <w:r>
+        <w:t xml:space="preserve">parameter appears directly inside the likelihood by construction.</w:t>
       </w:r>
     </w:p>
     <w:p>
@@ -25252,13 +25215,13 @@
         <w:t xml:space="preserve"> </w:t>
       </w:r>
       <w:r>
-        <w:t xml:space="preserve">concrete directions include: validating the decoupled-base-distribution</w:t>
-      </w:r>
-      <w:r>
-        <w:t xml:space="preserve"> </w:t>
-      </w:r>
-      <w:r>
-        <w:t xml:space="preserve">flow architecture described above at production scale; extending the</w:t>
+        <w:t xml:space="preserve">concrete directions include validating the decoupled-base-distribution</w:t>
+      </w:r>
+      <w:r>
+        <w:t xml:space="preserve"> </w:t>
+      </w:r>
+      <w:r>
+        <w:t xml:space="preserve">flow architecture described above at production scale, extending the</w:t>
       </w:r>
       <w:r>
         <w:t xml:space="preserve"> </w:t>
@@ -25270,7 +25233,7 @@
         <w:t xml:space="preserve"> </w:t>
       </w:r>
       <w:r>
-        <w:t xml:space="preserve">disposition; and, given that the nonlinear tier’s numerical integration</w:t>
+        <w:t xml:space="preserve">disposition, and, given that the nonlinear tier’s numerical integration</w:t>
       </w:r>
       <w:r>
         <w:t xml:space="preserve"> </w:t>
@@ -25300,10 +25263,7 @@
         <w:t xml:space="preserve">(Rackauckas and Nie 2017)</w:t>
       </w:r>
       <w:r>
-        <w:t xml:space="preserve"> </w:t>
-      </w:r>
-      <w:r>
-        <w:t xml:space="preserve">– already used by</w:t>
+        <w:t xml:space="preserve">, already used by</w:t>
       </w:r>
       <w:r>
         <w:t xml:space="preserve"> </w:t>
@@ -25315,7 +25275,7 @@
         <w:t xml:space="preserve"> </w:t>
       </w:r>
       <w:r>
-        <w:t xml:space="preserve">for their more structurally complex model – would</w:t>
+        <w:t xml:space="preserve">for their more structurally complex model, would</w:t>
       </w:r>
       <w:r>
         <w:t xml:space="preserve"> </w:t>
@@ -25331,7 +25291,7 @@
       </w:r>
     </w:p>
     <w:bookmarkEnd w:id="83"/>
-    <w:bookmarkStart w:id="102" w:name="references"/>
+    <w:bookmarkStart w:id="103" w:name="references"/>
     <w:p>
       <w:pPr>
         <w:pStyle w:val="Heading2"/>
@@ -25340,7 +25300,7 @@
         <w:t xml:space="preserve">References</w:t>
       </w:r>
     </w:p>
-    <w:bookmarkStart w:id="101" w:name="refs"/>
+    <w:bookmarkStart w:id="102" w:name="refs"/>
     <w:bookmarkStart w:id="84" w:name="ref-arruda2024amortized"/>
     <w:p>
       <w:pPr>
@@ -25376,23 +25336,77 @@
       </w:r>
     </w:p>
     <w:bookmarkEnd w:id="84"/>
-    <w:bookmarkStart w:id="85" w:name="ref-PLACEHOLDER_group3"/>
+    <w:bookmarkStart w:id="86" w:name="ref-baaz2026empirical"/>
     <w:p>
       <w:pPr>
         <w:pStyle w:val="Bibliography"/>
       </w:pPr>
       <w:r>
-        <w:t xml:space="preserve">Baaz et al.</w:t>
-      </w:r>
-      <w:r>
-        <w:t xml:space="preserve"> </w:t>
-      </w:r>
-      <w:r>
-        <w:t xml:space="preserve">“TODO – Fill in: Baaz Et Al., Variational Inference for NLME Models.”</w:t>
+        <w:t xml:space="preserve">Baaz, Marcus, Anders Sjöberg, and Mats Jirstrand. 2026.</w:t>
+      </w:r>
+      <w:r>
+        <w:t xml:space="preserve"> </w:t>
+      </w:r>
+      <w:r>
+        <w:t xml:space="preserve">“The Empirical</w:t>
+      </w:r>
+      <w:r>
+        <w:t xml:space="preserve"> </w:t>
+      </w:r>
+      <w:r>
+        <w:t xml:space="preserve">Bayes</w:t>
+      </w:r>
+      <w:r>
+        <w:t xml:space="preserve"> </w:t>
+      </w:r>
+      <w:r>
+        <w:t xml:space="preserve">Variational Autoencoder: A Neural</w:t>
+      </w:r>
+      <w:r>
+        <w:t xml:space="preserve"> </w:t>
+      </w:r>
+      <w:r>
+        <w:t xml:space="preserve">ODE</w:t>
+      </w:r>
+      <w:r>
+        <w:t xml:space="preserve"> </w:t>
+      </w:r>
+      <w:r>
+        <w:t xml:space="preserve">Approach for Population Modeling in Pharmacology.”</w:t>
+      </w:r>
+      <w:r>
+        <w:t xml:space="preserve"> </w:t>
+      </w:r>
+      <w:r>
+        <w:rPr>
+          <w:i/>
+          <w:iCs/>
+        </w:rPr>
+        <w:t xml:space="preserve">CPT: Pharmacometrics &amp; Systems Pharmacology</w:t>
+      </w:r>
+      <w:r>
+        <w:t xml:space="preserve"> </w:t>
+      </w:r>
+      <w:r>
+        <w:t xml:space="preserve">15 (7): e70280.</w:t>
+      </w:r>
+      <w:r>
+        <w:t xml:space="preserve"> </w:t>
+      </w:r>
+      <w:hyperlink r:id="rId85">
+        <w:r>
+          <w:rPr>
+            <w:rStyle w:val="Hyperlink"/>
+          </w:rPr>
+          <w:t xml:space="preserve">https://doi.org/10.1002/psp4.70280</w:t>
+        </w:r>
+      </w:hyperlink>
+      <w:r>
+        <w:t xml:space="preserve">.</w:t>
       </w:r>
     </w:p>
-    <w:bookmarkEnd w:id="85"/>
-    <w:bookmarkStart w:id="86" w:name="ref-beal1980nonmem"/>
+    <w:bookmarkEnd w:id="86"/>
+    <w:bookmarkStart w:id="87" w:name="ref-beal1980nonmem"/>
     <w:p>
       <w:pPr>
         <w:pStyle w:val="Bibliography"/>
@@ -25435,8 +25449,8 @@
         <w:t xml:space="preserve">34 (2): 118–19.</w:t>
       </w:r>
     </w:p>
-    <w:bookmarkEnd w:id="86"/>
-    <w:bookmarkStart w:id="87" w:name="ref-boeckmann1994nonmem"/>
+    <w:bookmarkEnd w:id="87"/>
+    <w:bookmarkStart w:id="88" w:name="ref-boeckmann1994nonmem"/>
     <w:p>
       <w:pPr>
         <w:pStyle w:val="Bibliography"/>
@@ -25466,8 +25480,8 @@
         <w:t xml:space="preserve">University of California, San Francisco.</w:t>
       </w:r>
     </w:p>
-    <w:bookmarkEnd w:id="87"/>
-    <w:bookmarkStart w:id="88" w:name="ref-burda2016importance"/>
+    <w:bookmarkEnd w:id="88"/>
+    <w:bookmarkStart w:id="89" w:name="ref-burda2016importance"/>
     <w:p>
       <w:pPr>
         <w:pStyle w:val="Bibliography"/>
@@ -25501,8 +25515,8 @@
         <w:t xml:space="preserve">.</w:t>
       </w:r>
     </w:p>
-    <w:bookmarkEnd w:id="88"/>
-    <w:bookmarkStart w:id="89" w:name="ref-fidler2019nonlinear"/>
+    <w:bookmarkEnd w:id="89"/>
+    <w:bookmarkStart w:id="90" w:name="ref-fidler2019nonlinear"/>
     <w:p>
       <w:pPr>
         <w:pStyle w:val="Bibliography"/>
@@ -25557,8 +25571,8 @@
         <w:t xml:space="preserve">8 (9): 621–33.</w:t>
       </w:r>
     </w:p>
-    <w:bookmarkEnd w:id="89"/>
-    <w:bookmarkStart w:id="90" w:name="ref-kuhn2005maximum"/>
+    <w:bookmarkEnd w:id="90"/>
+    <w:bookmarkStart w:id="91" w:name="ref-kuhn2005maximum"/>
     <w:p>
       <w:pPr>
         <w:pStyle w:val="Bibliography"/>
@@ -25589,24 +25603,37 @@
         <w:t xml:space="preserve">49 (4): 1020–38.</w:t>
       </w:r>
     </w:p>
-    <w:bookmarkEnd w:id="90"/>
-    <w:bookmarkStart w:id="91" w:name="ref-PLACEHOLDER_group2"/>
+    <w:bookmarkEnd w:id="91"/>
+    <w:bookmarkStart w:id="92" w:name="ref-li2026variational"/>
     <w:p>
       <w:pPr>
         <w:pStyle w:val="Bibliography"/>
       </w:pPr>
       <w:r>
-        <w:t xml:space="preserve">Li et al.</w:t>
-      </w:r>
-      <w:r>
-        <w:t xml:space="preserve"> </w:t>
-      </w:r>
-      <w:r>
-        <w:t xml:space="preserve">“TODO – Fill in: Li Et Al., Variational Inference for NLME Models.”</w:t>
+        <w:t xml:space="preserve">Li, Zhe, Mélanie Prague, Rodolphe Thiébaut, and Quentin Clairon. 2026.</w:t>
+      </w:r>
+      <w:r>
+        <w:t xml:space="preserve"> </w:t>
+      </w:r>
+      <w:r>
+        <w:t xml:space="preserve">“Variational Autoencoder for Inference of Nonlinear Mixed Effect Models Based on Ordinary Differential Equations.”</w:t>
+      </w:r>
+      <w:r>
+        <w:t xml:space="preserve"> </w:t>
+      </w:r>
+      <w:r>
+        <w:rPr>
+          <w:i/>
+          <w:iCs/>
+        </w:rPr>
+        <w:t xml:space="preserve">arXiv Preprint arXiv:2601.17400</w:t>
+      </w:r>
+      <w:r>
+        <w:t xml:space="preserve">.</w:t>
       </w:r>
     </w:p>
-    <w:bookmarkEnd w:id="91"/>
-    <w:bookmarkStart w:id="92" w:name="ref-oreilly1968studies"/>
+    <w:bookmarkEnd w:id="92"/>
+    <w:bookmarkStart w:id="93" w:name="ref-oreilly1968studies"/>
     <w:p>
       <w:pPr>
         <w:pStyle w:val="Bibliography"/>
@@ -25637,8 +25664,8 @@
         <w:t xml:space="preserve">38 (1): 169–77.</w:t>
       </w:r>
     </w:p>
-    <w:bookmarkEnd w:id="92"/>
-    <w:bookmarkStart w:id="93" w:name="ref-papamakarios2021normalizing"/>
+    <w:bookmarkEnd w:id="93"/>
+    <w:bookmarkStart w:id="94" w:name="ref-papamakarios2021normalizing"/>
     <w:p>
       <w:pPr>
         <w:pStyle w:val="Bibliography"/>
@@ -25669,8 +25696,8 @@
         <w:t xml:space="preserve">22 (57): 1–64.</w:t>
       </w:r>
     </w:p>
-    <w:bookmarkEnd w:id="93"/>
-    <w:bookmarkStart w:id="94" w:name="ref-paszke2019pytorch"/>
+    <w:bookmarkEnd w:id="94"/>
+    <w:bookmarkStart w:id="95" w:name="ref-paszke2019pytorch"/>
     <w:p>
       <w:pPr>
         <w:pStyle w:val="Bibliography"/>
@@ -25710,8 +25737,8 @@
         <w:t xml:space="preserve">. Vol. 32.</w:t>
       </w:r>
     </w:p>
-    <w:bookmarkEnd w:id="94"/>
-    <w:bookmarkStart w:id="95" w:name="ref-pinheiro1994topics"/>
+    <w:bookmarkEnd w:id="95"/>
+    <w:bookmarkStart w:id="96" w:name="ref-pinheiro1994topics"/>
     <w:p>
       <w:pPr>
         <w:pStyle w:val="Bibliography"/>
@@ -25732,8 +25759,8 @@
         <w:t xml:space="preserve">PhD thesis, Madison, USA: University of Wisconsin, Madison.</w:t>
       </w:r>
     </w:p>
-    <w:bookmarkEnd w:id="95"/>
-    <w:bookmarkStart w:id="96" w:name="ref-rackauckas2017differentialequations"/>
+    <w:bookmarkEnd w:id="96"/>
+    <w:bookmarkStart w:id="97" w:name="ref-rackauckas2017differentialequations"/>
     <w:p>
       <w:pPr>
         <w:pStyle w:val="Bibliography"/>
@@ -25751,10 +25778,7 @@
         <w:t xml:space="preserve">DifferentialEquations.jl</w:t>
       </w:r>
       <w:r>
-        <w:t xml:space="preserve"> </w:t>
-      </w:r>
-      <w:r>
-        <w:t xml:space="preserve">– a Performant and Feature-Rich Ecosystem for Solving Differential Equations in</w:t>
+        <w:t xml:space="preserve">: A Performant and Feature-Rich Ecosystem for Solving Differential Equations in</w:t>
       </w:r>
       <w:r>
         <w:t xml:space="preserve"> </w:t>
@@ -25782,8 +25806,8 @@
         <w:t xml:space="preserve">5 (1).</w:t>
       </w:r>
     </w:p>
-    <w:bookmarkEnd w:id="96"/>
-    <w:bookmarkStart w:id="97" w:name="ref-rezende2015variational"/>
+    <w:bookmarkEnd w:id="97"/>
+    <w:bookmarkStart w:id="98" w:name="ref-rezende2015variational"/>
     <w:p>
       <w:pPr>
         <w:pStyle w:val="Bibliography"/>
@@ -25817,8 +25841,8 @@
         <w:t xml:space="preserve">, 1530–38. PMLR.</w:t>
       </w:r>
     </w:p>
-    <w:bookmarkEnd w:id="97"/>
-    <w:bookmarkStart w:id="98" w:name="ref-self1987asymptotic"/>
+    <w:bookmarkEnd w:id="98"/>
+    <w:bookmarkStart w:id="99" w:name="ref-self1987asymptotic"/>
     <w:p>
       <w:pPr>
         <w:pStyle w:val="Bibliography"/>
@@ -25849,24 +25873,37 @@
         <w:t xml:space="preserve">82 (398): 605–10.</w:t>
       </w:r>
     </w:p>
-    <w:bookmarkEnd w:id="98"/>
-    <w:bookmarkStart w:id="99" w:name="ref-PLACEHOLDER_group1"/>
+    <w:bookmarkEnd w:id="99"/>
+    <w:bookmarkStart w:id="100" w:name="ref-tarek2026fitting"/>
     <w:p>
       <w:pPr>
         <w:pStyle w:val="Bibliography"/>
       </w:pPr>
       <w:r>
-        <w:t xml:space="preserve">Tarek, and Afonso.</w:t>
-      </w:r>
-      <w:r>
-        <w:t xml:space="preserve"> </w:t>
-      </w:r>
-      <w:r>
-        <w:t xml:space="preserve">“TODO – Fill in: Tarek &amp; Afonso, Variational Inference for NLME Models.”</w:t>
+        <w:t xml:space="preserve">Tarek, Mohamed, and Pedro Afonso. 2026.</w:t>
+      </w:r>
+      <w:r>
+        <w:t xml:space="preserve"> </w:t>
+      </w:r>
+      <w:r>
+        <w:t xml:space="preserve">“Fitting Large Nonlinear Mixed Effects Models Using Variational Expectation Maximization.”</w:t>
+      </w:r>
+      <w:r>
+        <w:t xml:space="preserve"> </w:t>
+      </w:r>
+      <w:r>
+        <w:rPr>
+          <w:i/>
+          <w:iCs/>
+        </w:rPr>
+        <w:t xml:space="preserve">arXiv Preprint arXiv:2604.26160</w:t>
+      </w:r>
+      <w:r>
+        <w:t xml:space="preserve">.</w:t>
       </w:r>
     </w:p>
-    <w:bookmarkEnd w:id="99"/>
-    <w:bookmarkStart w:id="100" w:name="ref-wang2008derivation"/>
+    <w:bookmarkEnd w:id="100"/>
+    <w:bookmarkStart w:id="101" w:name="ref-wang2008derivation"/>
     <w:p>
       <w:pPr>
         <w:pStyle w:val="Bibliography"/>
@@ -25909,9 +25946,9 @@
         <w:t xml:space="preserve">35 (2): 249–49.</w:t>
       </w:r>
     </w:p>
-    <w:bookmarkEnd w:id="100"/>
     <w:bookmarkEnd w:id="101"/>
     <w:bookmarkEnd w:id="102"/>
+    <w:bookmarkEnd w:id="103"/>
     <w:sectPr>
       <w:footnotePr>
         <w:numRestart w:val="eachSect"/>

</xml_diff>